<commit_message>
vault backup: 2026-06-16 19:28:00
</commit_message>
<xml_diff>
--- a/90_Career/00-我的简历/imgs/杨少鹏-礼来-SrPrincipleEngineer-20250827-bilingual.docx
+++ b/90_Career/00-我的简历/imgs/杨少鹏-礼来-SrPrincipleEngineer-20250827-bilingual.docx
@@ -1680,2113 +1680,2388 @@
           <w:szCs w:val="24"/>
           <w:lang w:val="en-US" w:eastAsia="zh-CN"/>
         </w:rPr>
-        <w:t>负责领导工厂的数字化项目，尤其是新的数字化技术和全球数字化领先解决方案在礼来苏州工厂的实时，包括先进数据分析，人工智能(ML/LLM/Agent</w:t>
+        <w:t>负责领导工厂的数字化项目，尤其是新的数字化技术和全球数字化领先解决方案在礼来苏州工厂的实时，包括先进数据分析，人工智能(ML/LLM/Agent)，物联网相关的数字化方案实施。</w:t>
+      </w:r>
+    </w:p>
+    <w:p>
+      <w:pPr>
+        <w:pStyle w:val="9"/>
+        <w:numPr>
+          <w:ilvl w:val="0"/>
+          <w:numId w:val="4"/>
+        </w:numPr>
+        <w:ind w:left="786" w:leftChars="0" w:hanging="360" w:firstLineChars="0"/>
+        <w:jc w:val="left"/>
+        <w:rPr>
+          <w:rFonts w:hint="default" w:asciiTheme="majorEastAsia" w:hAnsiTheme="majorEastAsia" w:eastAsiaTheme="majorEastAsia"/>
+          <w:bCs/>
+          <w:sz w:val="22"/>
+          <w:szCs w:val="24"/>
+          <w:u w:val="single"/>
+          <w:lang w:val="en-US" w:eastAsia="zh-CN"/>
+        </w:rPr>
+      </w:pPr>
+      <w:r>
+        <w:rPr>
+          <w:rFonts w:hint="eastAsia" w:asciiTheme="majorEastAsia" w:hAnsiTheme="majorEastAsia" w:eastAsiaTheme="majorEastAsia"/>
+          <w:bCs/>
+          <w:sz w:val="22"/>
+          <w:szCs w:val="24"/>
+          <w:u w:val="single"/>
+          <w:lang w:val="en-US" w:eastAsia="zh-CN"/>
+        </w:rPr>
+        <w:t>AI及数字化需求分析师和架构师</w:t>
+      </w:r>
+    </w:p>
+    <w:p>
+      <w:pPr>
+        <w:pStyle w:val="9"/>
+        <w:ind w:left="786"/>
+        <w:jc w:val="left"/>
+        <w:rPr>
+          <w:rFonts w:hint="default" w:asciiTheme="majorEastAsia" w:hAnsiTheme="majorEastAsia" w:eastAsiaTheme="majorEastAsia"/>
+          <w:bCs/>
+          <w:sz w:val="22"/>
+          <w:szCs w:val="24"/>
+          <w:lang w:val="en-US" w:eastAsia="zh-CN"/>
+        </w:rPr>
+      </w:pPr>
+      <w:r>
+        <w:rPr>
+          <w:rFonts w:hint="eastAsia" w:asciiTheme="majorEastAsia" w:hAnsiTheme="majorEastAsia" w:eastAsiaTheme="majorEastAsia"/>
+          <w:bCs/>
+          <w:sz w:val="22"/>
+          <w:szCs w:val="24"/>
+          <w:lang w:val="en-US" w:eastAsia="zh-CN"/>
+        </w:rPr>
+        <w:t>负责与礼来其他工厂和全球不同功能组织的深入沟通，总结归纳用户需求，调研市场解决方案，提供可行</w:t>
+      </w:r>
+      <w:r>
+        <w:rPr>
+          <w:rFonts w:hint="eastAsia" w:asciiTheme="majorEastAsia" w:hAnsiTheme="majorEastAsia" w:eastAsiaTheme="majorEastAsia"/>
+          <w:bCs/>
+          <w:sz w:val="22"/>
+          <w:szCs w:val="24"/>
+          <w:lang w:val="en-US" w:eastAsia="zh-CN"/>
+        </w:rPr>
+        <w:tab/>
+      </w:r>
+      <w:r>
+        <w:rPr>
+          <w:rFonts w:hint="eastAsia" w:asciiTheme="majorEastAsia" w:hAnsiTheme="majorEastAsia" w:eastAsiaTheme="majorEastAsia"/>
+          <w:bCs/>
+          <w:sz w:val="22"/>
+          <w:szCs w:val="24"/>
+          <w:lang w:val="en-US" w:eastAsia="zh-CN"/>
+        </w:rPr>
+        <w:t>的技术方案及架构，并负责实施。</w:t>
+      </w:r>
+    </w:p>
+    <w:p>
+      <w:pPr>
+        <w:pStyle w:val="9"/>
+        <w:numPr>
+          <w:ilvl w:val="0"/>
+          <w:numId w:val="0"/>
+        </w:numPr>
+        <w:ind w:leftChars="0"/>
+        <w:jc w:val="left"/>
+        <w:rPr>
+          <w:rFonts w:hint="default" w:eastAsiaTheme="majorEastAsia"/>
+          <w:b/>
+          <w:sz w:val="22"/>
+          <w:szCs w:val="24"/>
+          <w:lang w:val="en-US"/>
+        </w:rPr>
+      </w:pPr>
+    </w:p>
+    <w:p>
+      <w:pPr>
+        <w:pStyle w:val="9"/>
+        <w:numPr>
+          <w:ilvl w:val="0"/>
+          <w:numId w:val="3"/>
+        </w:numPr>
+        <w:jc w:val="left"/>
+        <w:rPr>
+          <w:rFonts w:eastAsiaTheme="majorEastAsia"/>
+          <w:b/>
+          <w:sz w:val="22"/>
+          <w:szCs w:val="24"/>
+        </w:rPr>
+      </w:pPr>
+      <w:r>
+        <w:rPr>
+          <w:rFonts w:eastAsiaTheme="majorEastAsia"/>
+          <w:b/>
+          <w:sz w:val="22"/>
+          <w:szCs w:val="24"/>
+        </w:rPr>
+        <w:t>2021.06 -</w:t>
+      </w:r>
+      <w:r>
+        <w:rPr>
+          <w:rFonts w:hint="eastAsia" w:eastAsiaTheme="majorEastAsia"/>
+          <w:b/>
+          <w:sz w:val="22"/>
+          <w:szCs w:val="24"/>
+          <w:lang w:val="en-US" w:eastAsia="zh-CN"/>
+        </w:rPr>
+        <w:t xml:space="preserve"> 2025.11</w:t>
+      </w:r>
+      <w:r>
+        <w:rPr>
+          <w:rFonts w:eastAsiaTheme="majorEastAsia"/>
+          <w:b/>
+          <w:sz w:val="22"/>
+          <w:szCs w:val="24"/>
+        </w:rPr>
+        <w:tab/>
+      </w:r>
+      <w:r>
+        <w:rPr>
+          <w:rFonts w:hint="eastAsia" w:eastAsiaTheme="majorEastAsia"/>
+          <w:b/>
+          <w:sz w:val="22"/>
+          <w:szCs w:val="24"/>
+        </w:rPr>
+        <w:t>西门子（中国）有限公司无锡创新中心</w:t>
+      </w:r>
+      <w:r>
+        <w:rPr>
+          <w:rFonts w:eastAsiaTheme="majorEastAsia"/>
+          <w:b/>
+          <w:sz w:val="22"/>
+          <w:szCs w:val="24"/>
+        </w:rPr>
+        <w:tab/>
+      </w:r>
+      <w:r>
+        <w:rPr>
+          <w:rFonts w:eastAsiaTheme="majorEastAsia"/>
+          <w:b/>
+          <w:sz w:val="22"/>
+          <w:szCs w:val="24"/>
+        </w:rPr>
+        <w:t xml:space="preserve"> </w:t>
+      </w:r>
+      <w:r>
+        <w:rPr>
+          <w:rFonts w:hint="eastAsia" w:eastAsiaTheme="majorEastAsia"/>
+          <w:b/>
+          <w:sz w:val="22"/>
+          <w:szCs w:val="24"/>
+        </w:rPr>
+        <w:t>专家工程师</w:t>
+      </w:r>
+      <w:r>
+        <w:rPr>
+          <w:rFonts w:hint="eastAsia" w:eastAsiaTheme="majorEastAsia"/>
+          <w:b/>
+          <w:sz w:val="22"/>
+          <w:szCs w:val="24"/>
+          <w:lang w:val="en-US" w:eastAsia="zh-CN"/>
+        </w:rPr>
+        <w:t xml:space="preserve"> Expert Engineer</w:t>
+      </w:r>
+    </w:p>
+    <w:p>
+      <w:pPr>
+        <w:pStyle w:val="9"/>
+        <w:numPr>
+          <w:ilvl w:val="0"/>
+          <w:numId w:val="5"/>
+        </w:numPr>
+        <w:ind w:left="426" w:leftChars="0"/>
+        <w:jc w:val="left"/>
+        <w:rPr>
+          <w:rFonts w:asciiTheme="majorEastAsia" w:hAnsiTheme="majorEastAsia" w:eastAsiaTheme="majorEastAsia"/>
+          <w:bCs/>
+          <w:sz w:val="22"/>
+          <w:szCs w:val="24"/>
+          <w:u w:val="single"/>
+        </w:rPr>
+      </w:pPr>
+      <w:r>
+        <w:rPr>
+          <w:rFonts w:hint="eastAsia" w:asciiTheme="majorEastAsia" w:hAnsiTheme="majorEastAsia" w:eastAsiaTheme="majorEastAsia"/>
+          <w:bCs/>
+          <w:sz w:val="22"/>
+          <w:szCs w:val="24"/>
+          <w:u w:val="single"/>
+        </w:rPr>
+        <w:t>数据收集、建模和分析架构师</w:t>
+      </w:r>
+    </w:p>
+    <w:p>
+      <w:pPr>
+        <w:pStyle w:val="9"/>
+        <w:numPr>
+          <w:ilvl w:val="0"/>
+          <w:numId w:val="6"/>
+        </w:numPr>
+        <w:jc w:val="left"/>
+        <w:rPr>
+          <w:rFonts w:asciiTheme="majorEastAsia" w:hAnsiTheme="majorEastAsia" w:eastAsiaTheme="majorEastAsia"/>
+          <w:bCs/>
+          <w:sz w:val="22"/>
+          <w:szCs w:val="24"/>
+          <w:u w:val="single"/>
+        </w:rPr>
+      </w:pPr>
+      <w:r>
+        <w:rPr>
+          <w:rFonts w:hint="eastAsia" w:asciiTheme="majorEastAsia" w:hAnsiTheme="majorEastAsia" w:eastAsiaTheme="majorEastAsia"/>
+          <w:bCs/>
+          <w:sz w:val="22"/>
+          <w:szCs w:val="24"/>
+          <w:u w:val="single"/>
+        </w:rPr>
+        <w:t>工业物联网预测性维护解决方案(</w:t>
+      </w:r>
+      <w:r>
+        <w:rPr>
+          <w:rFonts w:asciiTheme="majorEastAsia" w:hAnsiTheme="majorEastAsia" w:eastAsiaTheme="majorEastAsia"/>
+          <w:bCs/>
+          <w:sz w:val="22"/>
+          <w:szCs w:val="24"/>
+          <w:u w:val="single"/>
+        </w:rPr>
+        <w:t>Python, Vue.js, SQL</w:t>
+      </w:r>
+      <w:r>
+        <w:rPr>
+          <w:rFonts w:hint="eastAsia" w:asciiTheme="majorEastAsia" w:hAnsiTheme="majorEastAsia" w:eastAsiaTheme="majorEastAsia"/>
+          <w:bCs/>
+          <w:sz w:val="22"/>
+          <w:szCs w:val="24"/>
+          <w:u w:val="single"/>
+        </w:rPr>
+        <w:t>,</w:t>
+      </w:r>
+      <w:r>
+        <w:rPr>
+          <w:rFonts w:asciiTheme="majorEastAsia" w:hAnsiTheme="majorEastAsia" w:eastAsiaTheme="majorEastAsia"/>
+          <w:bCs/>
+          <w:sz w:val="22"/>
+          <w:szCs w:val="24"/>
+          <w:u w:val="single"/>
+        </w:rPr>
+        <w:t xml:space="preserve"> Jupyter</w:t>
+      </w:r>
+      <w:r>
+        <w:rPr>
+          <w:rFonts w:hint="eastAsia" w:asciiTheme="majorEastAsia" w:hAnsiTheme="majorEastAsia" w:eastAsiaTheme="majorEastAsia"/>
+          <w:bCs/>
+          <w:sz w:val="22"/>
+          <w:szCs w:val="24"/>
+          <w:u w:val="single"/>
+        </w:rPr>
+        <w:t>,</w:t>
+      </w:r>
+      <w:r>
+        <w:rPr>
+          <w:rFonts w:asciiTheme="majorEastAsia" w:hAnsiTheme="majorEastAsia" w:eastAsiaTheme="majorEastAsia"/>
+          <w:bCs/>
+          <w:sz w:val="22"/>
+          <w:szCs w:val="24"/>
+          <w:u w:val="single"/>
+        </w:rPr>
+        <w:t xml:space="preserve"> Nginx</w:t>
+      </w:r>
+      <w:r>
+        <w:rPr>
+          <w:rFonts w:hint="eastAsia" w:asciiTheme="majorEastAsia" w:hAnsiTheme="majorEastAsia" w:eastAsiaTheme="majorEastAsia"/>
+          <w:bCs/>
+          <w:sz w:val="22"/>
+          <w:szCs w:val="24"/>
+          <w:u w:val="single"/>
+        </w:rPr>
+        <w:t>, AI</w:t>
+      </w:r>
+      <w:r>
+        <w:rPr>
+          <w:rFonts w:asciiTheme="majorEastAsia" w:hAnsiTheme="majorEastAsia" w:eastAsiaTheme="majorEastAsia"/>
+          <w:bCs/>
+          <w:sz w:val="22"/>
+          <w:szCs w:val="24"/>
+          <w:u w:val="single"/>
+        </w:rPr>
+        <w:t>)</w:t>
+      </w:r>
+    </w:p>
+    <w:p>
+      <w:pPr>
+        <w:pStyle w:val="9"/>
+        <w:ind w:left="786"/>
+        <w:jc w:val="left"/>
+        <w:rPr>
+          <w:rFonts w:asciiTheme="majorEastAsia" w:hAnsiTheme="majorEastAsia" w:eastAsiaTheme="majorEastAsia"/>
+          <w:bCs/>
+          <w:sz w:val="22"/>
+          <w:szCs w:val="24"/>
+        </w:rPr>
+      </w:pPr>
+      <w:bookmarkStart w:id="1" w:name="OLE_LINK5"/>
+      <w:r>
+        <w:rPr>
+          <w:rFonts w:hint="eastAsia" w:asciiTheme="majorEastAsia" w:hAnsiTheme="majorEastAsia" w:eastAsiaTheme="majorEastAsia"/>
+          <w:bCs/>
+          <w:sz w:val="22"/>
+          <w:szCs w:val="24"/>
+        </w:rPr>
+        <w:t>负责架构设计和核心编码实现。</w:t>
+      </w:r>
+      <w:bookmarkEnd w:id="1"/>
+      <w:r>
+        <w:rPr>
+          <w:rFonts w:hint="eastAsia" w:asciiTheme="majorEastAsia" w:hAnsiTheme="majorEastAsia" w:eastAsiaTheme="majorEastAsia"/>
+          <w:bCs/>
+          <w:sz w:val="22"/>
+          <w:szCs w:val="24"/>
+        </w:rPr>
+        <w:t>通过传感器（温湿度，振动，声音等信号）收集大数据，算法建模进行特征提取，给出预维护监控方案。包含IoT大数据建模与分析，算法处理，特征提取等，应用在工业物联网预维护场景。本解决方案已应用在汽车制造业，医疗行业，钻井行业等制造业。结合LLM，开发了智能数据助手、知识库等应用。</w:t>
+      </w:r>
+    </w:p>
+    <w:p>
+      <w:pPr>
+        <w:pStyle w:val="9"/>
+        <w:numPr>
+          <w:ilvl w:val="0"/>
+          <w:numId w:val="6"/>
+        </w:numPr>
+        <w:jc w:val="left"/>
+        <w:rPr>
+          <w:rFonts w:asciiTheme="majorEastAsia" w:hAnsiTheme="majorEastAsia" w:eastAsiaTheme="majorEastAsia"/>
+          <w:bCs/>
+          <w:sz w:val="22"/>
+          <w:szCs w:val="24"/>
+          <w:u w:val="single"/>
+        </w:rPr>
+      </w:pPr>
+      <w:bookmarkStart w:id="2" w:name="OLE_LINK4"/>
+      <w:r>
+        <w:rPr>
+          <w:rFonts w:hint="eastAsia" w:asciiTheme="majorEastAsia" w:hAnsiTheme="majorEastAsia" w:eastAsiaTheme="majorEastAsia"/>
+          <w:bCs/>
+          <w:sz w:val="22"/>
+          <w:szCs w:val="24"/>
+          <w:u w:val="single"/>
+        </w:rPr>
+        <w:t>城市物联网气象大数据和视频监控项目(</w:t>
+      </w:r>
+      <w:r>
+        <w:rPr>
+          <w:rFonts w:asciiTheme="majorEastAsia" w:hAnsiTheme="majorEastAsia" w:eastAsiaTheme="majorEastAsia"/>
+          <w:bCs/>
+          <w:sz w:val="22"/>
+          <w:szCs w:val="24"/>
+          <w:u w:val="single"/>
+        </w:rPr>
+        <w:t>Python, SQL, RabbitMQ, Kafka)</w:t>
+      </w:r>
+    </w:p>
+    <w:p>
+      <w:pPr>
+        <w:pStyle w:val="9"/>
+        <w:ind w:left="786"/>
+        <w:jc w:val="left"/>
+        <w:rPr>
+          <w:rFonts w:asciiTheme="majorEastAsia" w:hAnsiTheme="majorEastAsia" w:eastAsiaTheme="majorEastAsia"/>
+          <w:bCs/>
+          <w:sz w:val="22"/>
+          <w:szCs w:val="24"/>
+        </w:rPr>
+      </w:pPr>
+      <w:r>
+        <w:rPr>
+          <w:rFonts w:hint="eastAsia" w:asciiTheme="majorEastAsia" w:hAnsiTheme="majorEastAsia" w:eastAsiaTheme="majorEastAsia"/>
+          <w:bCs/>
+          <w:sz w:val="22"/>
+          <w:szCs w:val="24"/>
+        </w:rPr>
+        <w:t>负责架构设计和核心编码实现。通过覆盖无锡新吴区的传感器装置，收集大量数据并在云端处理后进行实时监控。摄像头应用在智慧停车。本项目为政府合作项目，已成功应用在无锡新吴区飞凤平台。</w:t>
+      </w:r>
+    </w:p>
+    <w:bookmarkEnd w:id="2"/>
+    <w:p>
+      <w:pPr>
+        <w:ind w:left="366" w:firstLine="420"/>
+        <w:jc w:val="left"/>
+        <w:rPr>
+          <w:rFonts w:asciiTheme="majorEastAsia" w:hAnsiTheme="majorEastAsia" w:eastAsiaTheme="majorEastAsia"/>
+          <w:bCs/>
+          <w:sz w:val="22"/>
+          <w:szCs w:val="24"/>
+          <w:u w:val="single"/>
+        </w:rPr>
+      </w:pPr>
+      <w:r>
+        <w:rPr>
+          <w:rFonts w:hint="eastAsia" w:asciiTheme="majorEastAsia" w:hAnsiTheme="majorEastAsia" w:eastAsiaTheme="majorEastAsia"/>
+          <w:bCs/>
+          <w:sz w:val="22"/>
+          <w:szCs w:val="24"/>
+        </w:rPr>
+        <w:t>3</w:t>
+      </w:r>
+      <w:r>
+        <w:rPr>
+          <w:rFonts w:asciiTheme="majorEastAsia" w:hAnsiTheme="majorEastAsia" w:eastAsiaTheme="majorEastAsia"/>
+          <w:bCs/>
+          <w:sz w:val="22"/>
+          <w:szCs w:val="24"/>
+        </w:rPr>
+        <w:t xml:space="preserve">. </w:t>
+      </w:r>
+      <w:r>
+        <w:rPr>
+          <w:rFonts w:hint="eastAsia" w:asciiTheme="majorEastAsia" w:hAnsiTheme="majorEastAsia" w:eastAsiaTheme="majorEastAsia"/>
+          <w:bCs/>
+          <w:sz w:val="22"/>
+          <w:szCs w:val="24"/>
+          <w:u w:val="single"/>
+        </w:rPr>
+        <w:t>城市物联网桥梁大数据监控项目(</w:t>
+      </w:r>
+      <w:r>
+        <w:rPr>
+          <w:rFonts w:asciiTheme="majorEastAsia" w:hAnsiTheme="majorEastAsia" w:eastAsiaTheme="majorEastAsia"/>
+          <w:bCs/>
+          <w:sz w:val="22"/>
+          <w:szCs w:val="24"/>
+          <w:u w:val="single"/>
+        </w:rPr>
+        <w:t>Python, SQL, Jupyter, Nginx)</w:t>
+      </w:r>
+    </w:p>
+    <w:p>
+      <w:pPr>
+        <w:pStyle w:val="9"/>
+        <w:ind w:left="786"/>
+        <w:jc w:val="left"/>
+        <w:rPr>
+          <w:rFonts w:asciiTheme="majorEastAsia" w:hAnsiTheme="majorEastAsia" w:eastAsiaTheme="majorEastAsia"/>
+          <w:bCs/>
+          <w:sz w:val="22"/>
+          <w:szCs w:val="24"/>
+        </w:rPr>
+      </w:pPr>
+      <w:r>
+        <w:rPr>
+          <w:rFonts w:hint="eastAsia" w:asciiTheme="majorEastAsia" w:hAnsiTheme="majorEastAsia" w:eastAsiaTheme="majorEastAsia"/>
+          <w:bCs/>
+          <w:sz w:val="22"/>
+          <w:szCs w:val="24"/>
+        </w:rPr>
+        <w:t>负责项目架构设计、开发及部署。通过安装在桥梁的振动传感器和摄像头组成的传感装置，收集大量桥梁振动数据，建模后提取车辆特征，实时监控桥梁上大卡车及超重车辆行驶情况。本项目已成功通过无锡市科创项目验收。</w:t>
+      </w:r>
+    </w:p>
+    <w:p>
+      <w:pPr>
+        <w:ind w:left="786"/>
+        <w:jc w:val="left"/>
+        <w:rPr>
+          <w:rFonts w:asciiTheme="majorEastAsia" w:hAnsiTheme="majorEastAsia" w:eastAsiaTheme="majorEastAsia"/>
+          <w:bCs/>
+          <w:sz w:val="22"/>
+          <w:szCs w:val="24"/>
+        </w:rPr>
+      </w:pPr>
+      <w:r>
+        <w:rPr>
+          <w:rFonts w:hint="eastAsia" w:asciiTheme="majorEastAsia" w:hAnsiTheme="majorEastAsia" w:eastAsiaTheme="majorEastAsia"/>
+          <w:bCs/>
+          <w:sz w:val="22"/>
+          <w:szCs w:val="24"/>
+        </w:rPr>
+        <w:t xml:space="preserve">4. </w:t>
+      </w:r>
+      <w:r>
+        <w:rPr>
+          <w:rFonts w:hint="eastAsia" w:asciiTheme="majorEastAsia" w:hAnsiTheme="majorEastAsia" w:eastAsiaTheme="majorEastAsia"/>
+          <w:bCs/>
+          <w:sz w:val="22"/>
+          <w:szCs w:val="24"/>
+          <w:u w:val="single"/>
+        </w:rPr>
+        <w:t>大语言模型LLM预研及应用开发</w:t>
+      </w:r>
+    </w:p>
+    <w:p>
+      <w:pPr>
+        <w:ind w:left="786"/>
+        <w:jc w:val="left"/>
+        <w:rPr>
+          <w:rFonts w:asciiTheme="majorEastAsia" w:hAnsiTheme="majorEastAsia" w:eastAsiaTheme="majorEastAsia"/>
+          <w:bCs/>
+          <w:sz w:val="22"/>
+          <w:szCs w:val="24"/>
+        </w:rPr>
+      </w:pPr>
+      <w:r>
+        <w:rPr>
+          <w:rFonts w:hint="eastAsia" w:asciiTheme="majorEastAsia" w:hAnsiTheme="majorEastAsia" w:eastAsiaTheme="majorEastAsia"/>
+          <w:bCs/>
+          <w:sz w:val="22"/>
+          <w:szCs w:val="24"/>
+        </w:rPr>
+        <w:t>负责架构设计和核心代码实现，结合西门子IoT云平台服务，预研大模型使用场景及编程实现，覆盖竞品SWOT分析、编程框架对比及路径实现等。配合业务部门成功举办Hackathon及客户案例应用，多次在组织内进行相关技术分享。同时应用在智能数据分析及知识库助手等。</w:t>
+      </w:r>
+    </w:p>
+    <w:p>
+      <w:pPr>
+        <w:ind w:left="786"/>
+        <w:jc w:val="left"/>
+        <w:rPr>
+          <w:rFonts w:asciiTheme="majorEastAsia" w:hAnsiTheme="majorEastAsia" w:eastAsiaTheme="majorEastAsia"/>
+          <w:bCs/>
+          <w:sz w:val="22"/>
+          <w:szCs w:val="24"/>
+        </w:rPr>
+      </w:pPr>
+      <w:r>
+        <w:rPr>
+          <w:rFonts w:hint="eastAsia" w:asciiTheme="majorEastAsia" w:hAnsiTheme="majorEastAsia" w:eastAsiaTheme="majorEastAsia"/>
+          <w:bCs/>
+          <w:sz w:val="22"/>
+          <w:szCs w:val="24"/>
+        </w:rPr>
+        <w:t xml:space="preserve">5. </w:t>
+      </w:r>
+      <w:r>
+        <w:rPr>
+          <w:rFonts w:hint="eastAsia" w:asciiTheme="majorEastAsia" w:hAnsiTheme="majorEastAsia" w:eastAsiaTheme="majorEastAsia"/>
+          <w:bCs/>
+          <w:sz w:val="22"/>
+          <w:szCs w:val="24"/>
+          <w:u w:val="single"/>
+        </w:rPr>
+        <w:t>汽车行业数据空间Catena-X国内首次成功部署</w:t>
+      </w:r>
+    </w:p>
+    <w:p>
+      <w:pPr>
+        <w:ind w:left="786"/>
+        <w:jc w:val="left"/>
+        <w:rPr>
+          <w:rFonts w:asciiTheme="majorEastAsia" w:hAnsiTheme="majorEastAsia" w:eastAsiaTheme="majorEastAsia"/>
+          <w:bCs/>
+          <w:sz w:val="22"/>
+          <w:szCs w:val="24"/>
+        </w:rPr>
+      </w:pPr>
+      <w:r>
+        <w:rPr>
+          <w:rFonts w:hint="eastAsia" w:asciiTheme="majorEastAsia" w:hAnsiTheme="majorEastAsia" w:eastAsiaTheme="majorEastAsia"/>
+          <w:bCs/>
+          <w:sz w:val="22"/>
+          <w:szCs w:val="24"/>
+        </w:rPr>
+        <w:t>Catena-X是德国主导的欧洲汽车行业数据空间交换标准。从21年伊始关注并参与中国区会议，研究技术框架和尝试部署。在24年底短时间内（3天）成功在宁德时代总部（CATL）部署和宝马德国（BMW）的数据空间交换PoC，覆盖数据交换、电池护照和数字孪生等信息，成为国内首次成功实施的解决方案。</w:t>
+      </w:r>
+    </w:p>
+    <w:p>
+      <w:pPr>
+        <w:jc w:val="left"/>
+        <w:rPr>
+          <w:rFonts w:asciiTheme="majorEastAsia" w:hAnsiTheme="majorEastAsia" w:eastAsiaTheme="majorEastAsia"/>
+          <w:bCs/>
+          <w:sz w:val="22"/>
+          <w:szCs w:val="24"/>
+        </w:rPr>
+      </w:pPr>
+      <w:r>
+        <w:rPr>
+          <w:rFonts w:hint="eastAsia" w:asciiTheme="majorEastAsia" w:hAnsiTheme="majorEastAsia" w:eastAsiaTheme="majorEastAsia"/>
+          <w:bCs/>
+          <w:sz w:val="22"/>
+          <w:szCs w:val="24"/>
+        </w:rPr>
+        <w:t xml:space="preserve">    2. </w:t>
+      </w:r>
+      <w:r>
+        <w:rPr>
+          <w:rFonts w:hint="eastAsia" w:asciiTheme="majorEastAsia" w:hAnsiTheme="majorEastAsia" w:eastAsiaTheme="majorEastAsia"/>
+          <w:bCs/>
+          <w:sz w:val="22"/>
+          <w:szCs w:val="24"/>
+          <w:u w:val="single"/>
+        </w:rPr>
+        <w:t>项目经理</w:t>
+      </w:r>
+    </w:p>
+    <w:p>
+      <w:pPr>
+        <w:jc w:val="left"/>
+        <w:rPr>
+          <w:rFonts w:asciiTheme="majorEastAsia" w:hAnsiTheme="majorEastAsia" w:eastAsiaTheme="majorEastAsia"/>
+          <w:bCs/>
+          <w:sz w:val="22"/>
+          <w:szCs w:val="24"/>
+        </w:rPr>
+      </w:pPr>
+      <w:r>
+        <w:rPr>
+          <w:rFonts w:asciiTheme="majorEastAsia" w:hAnsiTheme="majorEastAsia" w:eastAsiaTheme="majorEastAsia"/>
+          <w:bCs/>
+          <w:sz w:val="22"/>
+          <w:szCs w:val="24"/>
+        </w:rPr>
+        <w:tab/>
+      </w:r>
+      <w:r>
+        <w:rPr>
+          <w:rFonts w:asciiTheme="majorEastAsia" w:hAnsiTheme="majorEastAsia" w:eastAsiaTheme="majorEastAsia"/>
+          <w:bCs/>
+          <w:sz w:val="22"/>
+          <w:szCs w:val="24"/>
+        </w:rPr>
+        <w:tab/>
+      </w:r>
+      <w:r>
+        <w:rPr>
+          <w:rFonts w:hint="eastAsia" w:asciiTheme="majorEastAsia" w:hAnsiTheme="majorEastAsia" w:eastAsiaTheme="majorEastAsia"/>
+          <w:bCs/>
+          <w:sz w:val="22"/>
+          <w:szCs w:val="24"/>
+        </w:rPr>
+        <w:t xml:space="preserve">1. </w:t>
+      </w:r>
+      <w:r>
+        <w:rPr>
+          <w:rFonts w:hint="eastAsia" w:asciiTheme="majorEastAsia" w:hAnsiTheme="majorEastAsia" w:eastAsiaTheme="majorEastAsia"/>
+          <w:bCs/>
+          <w:sz w:val="22"/>
+          <w:szCs w:val="24"/>
+          <w:u w:val="single"/>
+        </w:rPr>
+        <w:t>新吴区科创项目交付</w:t>
+      </w:r>
+    </w:p>
+    <w:p>
+      <w:pPr>
+        <w:ind w:left="840"/>
+        <w:jc w:val="left"/>
+        <w:rPr>
+          <w:rFonts w:asciiTheme="majorEastAsia" w:hAnsiTheme="majorEastAsia" w:eastAsiaTheme="majorEastAsia"/>
+          <w:bCs/>
+          <w:sz w:val="22"/>
+          <w:szCs w:val="24"/>
+        </w:rPr>
+      </w:pPr>
+      <w:r>
+        <w:rPr>
+          <w:rFonts w:hint="eastAsia" w:asciiTheme="majorEastAsia" w:hAnsiTheme="majorEastAsia" w:eastAsiaTheme="majorEastAsia"/>
+          <w:bCs/>
+          <w:sz w:val="22"/>
+          <w:szCs w:val="24"/>
+        </w:rPr>
+        <w:t>负责年度新吴区科创项目的选型、交付、成果验收及基金申请等项目，成功通过验收。同时沟通协调参加无锡年度物联网博览会。</w:t>
+      </w:r>
+    </w:p>
+    <w:p>
+      <w:pPr>
+        <w:jc w:val="left"/>
+        <w:rPr>
+          <w:rFonts w:asciiTheme="majorEastAsia" w:hAnsiTheme="majorEastAsia" w:eastAsiaTheme="majorEastAsia"/>
+          <w:bCs/>
+          <w:sz w:val="22"/>
+          <w:szCs w:val="24"/>
+        </w:rPr>
+      </w:pPr>
+      <w:r>
+        <w:rPr>
+          <w:rFonts w:asciiTheme="majorEastAsia" w:hAnsiTheme="majorEastAsia" w:eastAsiaTheme="majorEastAsia"/>
+          <w:bCs/>
+          <w:sz w:val="22"/>
+          <w:szCs w:val="24"/>
+        </w:rPr>
+        <w:tab/>
+      </w:r>
+      <w:r>
+        <w:rPr>
+          <w:rFonts w:asciiTheme="majorEastAsia" w:hAnsiTheme="majorEastAsia" w:eastAsiaTheme="majorEastAsia"/>
+          <w:bCs/>
+          <w:sz w:val="22"/>
+          <w:szCs w:val="24"/>
+        </w:rPr>
+        <w:tab/>
+      </w:r>
+      <w:r>
+        <w:rPr>
+          <w:rFonts w:hint="eastAsia" w:asciiTheme="majorEastAsia" w:hAnsiTheme="majorEastAsia" w:eastAsiaTheme="majorEastAsia"/>
+          <w:bCs/>
+          <w:sz w:val="22"/>
+          <w:szCs w:val="24"/>
+        </w:rPr>
+        <w:t xml:space="preserve">2. </w:t>
+      </w:r>
+      <w:r>
+        <w:rPr>
+          <w:rFonts w:hint="eastAsia" w:asciiTheme="majorEastAsia" w:hAnsiTheme="majorEastAsia" w:eastAsiaTheme="majorEastAsia"/>
+          <w:bCs/>
+          <w:sz w:val="22"/>
+          <w:szCs w:val="24"/>
+          <w:u w:val="single"/>
+        </w:rPr>
+        <w:t>Decoupling跨部门沟通</w:t>
+      </w:r>
+    </w:p>
+    <w:p>
+      <w:pPr>
+        <w:ind w:left="840"/>
+        <w:jc w:val="left"/>
+        <w:rPr>
+          <w:rFonts w:asciiTheme="majorEastAsia" w:hAnsiTheme="majorEastAsia" w:eastAsiaTheme="majorEastAsia"/>
+          <w:bCs/>
+          <w:sz w:val="22"/>
+          <w:szCs w:val="24"/>
+        </w:rPr>
+      </w:pPr>
+      <w:r>
+        <w:rPr>
+          <w:rFonts w:hint="eastAsia" w:asciiTheme="majorEastAsia" w:hAnsiTheme="majorEastAsia" w:eastAsiaTheme="majorEastAsia"/>
+          <w:bCs/>
+          <w:sz w:val="22"/>
+          <w:szCs w:val="24"/>
+        </w:rPr>
+        <w:t>主导“Decoupling”项目，聚焦于评估组织内部各项技术与中美技术脱钩背景的关联性。负责跨部门沟通协调，与技术专家及部门负责人共同识别技术共性及潜在风险点，分析其与脱钩趋势的相关性。项目涵盖多领域技术，要求较强的技术综合理解能力与高效沟通能力。最终交付成果为全面技术风险评估报告及针对性改进建议，为组织技术战略决策提供关键依据。</w:t>
+      </w:r>
+    </w:p>
+    <w:p>
+      <w:pPr>
+        <w:jc w:val="left"/>
+        <w:rPr>
+          <w:rFonts w:asciiTheme="majorEastAsia" w:hAnsiTheme="majorEastAsia" w:eastAsiaTheme="majorEastAsia"/>
+          <w:bCs/>
+          <w:sz w:val="22"/>
+          <w:szCs w:val="24"/>
+        </w:rPr>
+      </w:pPr>
+      <w:r>
+        <w:rPr>
+          <w:rFonts w:asciiTheme="majorEastAsia" w:hAnsiTheme="majorEastAsia" w:eastAsiaTheme="majorEastAsia"/>
+          <w:bCs/>
+          <w:sz w:val="22"/>
+          <w:szCs w:val="24"/>
+        </w:rPr>
+        <w:tab/>
+      </w:r>
+      <w:r>
+        <w:rPr>
+          <w:rFonts w:asciiTheme="majorEastAsia" w:hAnsiTheme="majorEastAsia" w:eastAsiaTheme="majorEastAsia"/>
+          <w:bCs/>
+          <w:sz w:val="22"/>
+          <w:szCs w:val="24"/>
+        </w:rPr>
+        <w:tab/>
+      </w:r>
+      <w:r>
+        <w:rPr>
+          <w:rFonts w:hint="eastAsia" w:asciiTheme="majorEastAsia" w:hAnsiTheme="majorEastAsia" w:eastAsiaTheme="majorEastAsia"/>
+          <w:bCs/>
+          <w:sz w:val="22"/>
+          <w:szCs w:val="24"/>
+        </w:rPr>
+        <w:t xml:space="preserve">3. </w:t>
+      </w:r>
+      <w:r>
+        <w:rPr>
+          <w:rFonts w:hint="eastAsia" w:asciiTheme="majorEastAsia" w:hAnsiTheme="majorEastAsia" w:eastAsiaTheme="majorEastAsia"/>
+          <w:bCs/>
+          <w:sz w:val="22"/>
+          <w:szCs w:val="24"/>
+          <w:u w:val="single"/>
+        </w:rPr>
+        <w:t>AirLink移植可行性项目交付</w:t>
+      </w:r>
+    </w:p>
+    <w:p>
+      <w:pPr>
+        <w:ind w:left="420"/>
+        <w:jc w:val="left"/>
+        <w:rPr>
+          <w:rFonts w:asciiTheme="majorEastAsia" w:hAnsiTheme="majorEastAsia" w:eastAsiaTheme="majorEastAsia"/>
+          <w:bCs/>
+          <w:sz w:val="22"/>
+          <w:szCs w:val="24"/>
+        </w:rPr>
+      </w:pPr>
+      <w:r>
+        <w:rPr>
+          <w:rFonts w:hint="eastAsia" w:asciiTheme="majorEastAsia" w:hAnsiTheme="majorEastAsia" w:eastAsiaTheme="majorEastAsia"/>
+          <w:bCs/>
+          <w:sz w:val="22"/>
+          <w:szCs w:val="24"/>
+        </w:rPr>
+        <w:t xml:space="preserve">    负责带领团队（6人）完成西门子AirLink从windows平台移植到Linux，尤其是利用Docker等容器化技术的可行性研究及尝试。最终成功交付经过验证的Demo及可行性报告，并利用Docker容器的网络和Privilege模式提出了进一步优化方案。</w:t>
+      </w:r>
+    </w:p>
+    <w:p>
+      <w:pPr>
+        <w:ind w:firstLine="420"/>
+        <w:jc w:val="left"/>
+        <w:rPr>
+          <w:rFonts w:asciiTheme="majorEastAsia" w:hAnsiTheme="majorEastAsia" w:eastAsiaTheme="majorEastAsia"/>
+          <w:bCs/>
+          <w:sz w:val="22"/>
+          <w:szCs w:val="24"/>
+        </w:rPr>
+      </w:pPr>
+      <w:r>
+        <w:rPr>
+          <w:rFonts w:hint="eastAsia" w:asciiTheme="majorEastAsia" w:hAnsiTheme="majorEastAsia" w:eastAsiaTheme="majorEastAsia"/>
+          <w:bCs/>
+          <w:sz w:val="22"/>
+          <w:szCs w:val="24"/>
+        </w:rPr>
+        <w:t xml:space="preserve">3. </w:t>
+      </w:r>
+      <w:r>
+        <w:rPr>
+          <w:rFonts w:hint="eastAsia" w:asciiTheme="majorEastAsia" w:hAnsiTheme="majorEastAsia" w:eastAsiaTheme="majorEastAsia"/>
+          <w:bCs/>
+          <w:sz w:val="22"/>
+          <w:szCs w:val="24"/>
+          <w:u w:val="single"/>
+        </w:rPr>
+        <w:t>沟通窗口</w:t>
+      </w:r>
+    </w:p>
+    <w:p>
+      <w:pPr>
+        <w:ind w:left="840"/>
+        <w:jc w:val="left"/>
+        <w:rPr>
+          <w:rFonts w:asciiTheme="majorEastAsia" w:hAnsiTheme="majorEastAsia" w:eastAsiaTheme="majorEastAsia"/>
+          <w:bCs/>
+          <w:sz w:val="22"/>
+          <w:szCs w:val="24"/>
+        </w:rPr>
+      </w:pPr>
+      <w:r>
+        <w:rPr>
+          <w:rFonts w:hint="eastAsia" w:asciiTheme="majorEastAsia" w:hAnsiTheme="majorEastAsia" w:eastAsiaTheme="majorEastAsia"/>
+          <w:bCs/>
+          <w:sz w:val="22"/>
+          <w:szCs w:val="24"/>
+        </w:rPr>
+        <w:t>1.负责与德国及其他欧洲同事、印度同事等对接，完成相关项目。其中独立负责某西门子中国工厂关键之间设备的软硬件升级的对接工作。</w:t>
+      </w:r>
+    </w:p>
+    <w:p>
+      <w:pPr>
+        <w:ind w:left="840"/>
+        <w:jc w:val="left"/>
+        <w:rPr>
+          <w:rFonts w:asciiTheme="majorEastAsia" w:hAnsiTheme="majorEastAsia" w:eastAsiaTheme="majorEastAsia"/>
+          <w:bCs/>
+          <w:sz w:val="22"/>
+          <w:szCs w:val="24"/>
+        </w:rPr>
+      </w:pPr>
+      <w:r>
+        <w:rPr>
+          <w:rFonts w:hint="eastAsia" w:asciiTheme="majorEastAsia" w:hAnsiTheme="majorEastAsia" w:eastAsiaTheme="majorEastAsia"/>
+          <w:bCs/>
+          <w:sz w:val="22"/>
+          <w:szCs w:val="24"/>
+        </w:rPr>
+        <w:t>2.负责筹备和组建“Open Source@西门子”年度活动（今年将举办第三届）。负责宣传、推广西门子在工业开源领域的进展和活动，同时邀请其他领域（Xenomai实时控制、人工智能、开源半导体，RISC-V等）嘉宾共同参与。作为演讲人介绍西门子LLM API方案，链接：</w:t>
+      </w:r>
+      <w:r>
+        <w:fldChar w:fldCharType="begin"/>
+      </w:r>
+      <w:r>
+        <w:instrText xml:space="preserve">HYPERLINK "https://opensource.siemens.com/events/2024cn/"</w:instrText>
+      </w:r>
+      <w:r>
+        <w:fldChar w:fldCharType="separate"/>
+      </w:r>
+      <w:r>
+        <w:rPr>
+          <w:rStyle w:val="6"/>
+          <w:rFonts w:asciiTheme="majorEastAsia" w:hAnsiTheme="majorEastAsia" w:eastAsiaTheme="majorEastAsia"/>
+          <w:bCs/>
+          <w:sz w:val="22"/>
+          <w:szCs w:val="24"/>
+        </w:rPr>
+        <w:t>opensource.siemens.com</w:t>
+      </w:r>
+      <w:r>
+        <w:fldChar w:fldCharType="end"/>
+      </w:r>
+      <w:r>
+        <w:rPr>
+          <w:rFonts w:hint="eastAsia" w:asciiTheme="majorEastAsia" w:hAnsiTheme="majorEastAsia" w:eastAsiaTheme="majorEastAsia"/>
+          <w:bCs/>
+          <w:sz w:val="22"/>
+          <w:szCs w:val="24"/>
+        </w:rPr>
+        <w:t>。</w:t>
+      </w:r>
+    </w:p>
+    <w:p>
+      <w:pPr>
+        <w:jc w:val="left"/>
+        <w:rPr>
+          <w:rFonts w:asciiTheme="majorEastAsia" w:hAnsiTheme="majorEastAsia" w:eastAsiaTheme="majorEastAsia"/>
+          <w:bCs/>
+          <w:sz w:val="22"/>
+          <w:szCs w:val="24"/>
+        </w:rPr>
+      </w:pPr>
+    </w:p>
+    <w:p>
+      <w:pPr>
+        <w:pStyle w:val="9"/>
+        <w:numPr>
+          <w:ilvl w:val="0"/>
+          <w:numId w:val="3"/>
+        </w:numPr>
+        <w:jc w:val="left"/>
+        <w:rPr>
+          <w:rFonts w:eastAsiaTheme="majorEastAsia"/>
+          <w:b/>
+          <w:sz w:val="22"/>
+          <w:szCs w:val="24"/>
+        </w:rPr>
+      </w:pPr>
+      <w:bookmarkStart w:id="3" w:name="OLE_LINK2"/>
+      <w:r>
+        <w:rPr>
+          <w:rFonts w:eastAsiaTheme="majorEastAsia"/>
+          <w:b/>
+          <w:sz w:val="22"/>
+          <w:szCs w:val="24"/>
+        </w:rPr>
+        <w:t>20</w:t>
+      </w:r>
+      <w:r>
+        <w:rPr>
+          <w:rFonts w:hint="eastAsia" w:eastAsiaTheme="majorEastAsia"/>
+          <w:b/>
+          <w:sz w:val="22"/>
+          <w:szCs w:val="24"/>
+        </w:rPr>
+        <w:t>20</w:t>
+      </w:r>
+      <w:r>
+        <w:rPr>
+          <w:rFonts w:eastAsiaTheme="majorEastAsia"/>
+          <w:b/>
+          <w:sz w:val="22"/>
+          <w:szCs w:val="24"/>
+        </w:rPr>
+        <w:t>.0</w:t>
+      </w:r>
+      <w:r>
+        <w:rPr>
+          <w:rFonts w:hint="eastAsia" w:eastAsiaTheme="majorEastAsia"/>
+          <w:b/>
+          <w:sz w:val="22"/>
+          <w:szCs w:val="24"/>
+        </w:rPr>
+        <w:t>6</w:t>
+      </w:r>
+      <w:r>
+        <w:rPr>
+          <w:rFonts w:eastAsiaTheme="majorEastAsia"/>
+          <w:b/>
+          <w:sz w:val="22"/>
+          <w:szCs w:val="24"/>
+        </w:rPr>
+        <w:t xml:space="preserve"> – 2021.6</w:t>
+      </w:r>
+      <w:r>
+        <w:rPr>
+          <w:rFonts w:eastAsiaTheme="majorEastAsia"/>
+          <w:b/>
+          <w:sz w:val="22"/>
+          <w:szCs w:val="24"/>
+        </w:rPr>
+        <w:tab/>
+      </w:r>
+      <w:r>
+        <w:rPr>
+          <w:rFonts w:hint="eastAsia" w:eastAsiaTheme="majorEastAsia"/>
+          <w:b/>
+          <w:sz w:val="22"/>
+          <w:szCs w:val="24"/>
+        </w:rPr>
+        <w:t>博世中国创新与软件开发中心</w:t>
+      </w:r>
+      <w:r>
+        <w:rPr>
+          <w:rFonts w:eastAsiaTheme="majorEastAsia"/>
+          <w:b/>
+          <w:sz w:val="22"/>
+          <w:szCs w:val="24"/>
+        </w:rPr>
+        <w:tab/>
+      </w:r>
+      <w:r>
+        <w:rPr>
+          <w:rFonts w:hint="eastAsia" w:eastAsiaTheme="majorEastAsia"/>
+          <w:b/>
+          <w:sz w:val="22"/>
+          <w:szCs w:val="24"/>
+        </w:rPr>
+        <w:t>Competence Leader</w:t>
+      </w:r>
+    </w:p>
+    <w:bookmarkEnd w:id="3"/>
+    <w:p>
+      <w:pPr>
+        <w:pStyle w:val="9"/>
+        <w:numPr>
+          <w:ilvl w:val="0"/>
+          <w:numId w:val="7"/>
+        </w:numPr>
+        <w:jc w:val="left"/>
+        <w:rPr>
+          <w:rFonts w:eastAsiaTheme="majorEastAsia"/>
+          <w:sz w:val="22"/>
+          <w:szCs w:val="24"/>
+          <w:u w:val="single"/>
+        </w:rPr>
+      </w:pPr>
+      <w:bookmarkStart w:id="4" w:name="OLE_LINK3"/>
+      <w:r>
+        <w:rPr>
+          <w:rFonts w:hint="eastAsia" w:eastAsiaTheme="majorEastAsia"/>
+          <w:sz w:val="22"/>
+          <w:szCs w:val="24"/>
+          <w:u w:val="single"/>
+        </w:rPr>
+        <w:t>联合汽车电子工具测试开发及车联网大数据项目经理(Jira</w:t>
+      </w:r>
+      <w:r>
+        <w:rPr>
+          <w:rFonts w:eastAsiaTheme="majorEastAsia"/>
+          <w:sz w:val="22"/>
+          <w:szCs w:val="24"/>
+          <w:u w:val="single"/>
+        </w:rPr>
+        <w:t>, Java, Python</w:t>
+      </w:r>
+      <w:r>
+        <w:rPr>
+          <w:rFonts w:hint="eastAsia" w:eastAsiaTheme="majorEastAsia"/>
+          <w:sz w:val="22"/>
+          <w:szCs w:val="24"/>
+          <w:u w:val="single"/>
+        </w:rPr>
+        <w:t>,</w:t>
+      </w:r>
+      <w:r>
+        <w:rPr>
+          <w:rFonts w:eastAsiaTheme="majorEastAsia"/>
+          <w:sz w:val="22"/>
+          <w:szCs w:val="24"/>
+          <w:u w:val="single"/>
+        </w:rPr>
+        <w:t xml:space="preserve"> Kafka, RabbitMQ, Vue.js</w:t>
+      </w:r>
+      <w:r>
+        <w:rPr>
+          <w:rFonts w:hint="eastAsia" w:eastAsiaTheme="majorEastAsia"/>
+          <w:sz w:val="22"/>
+          <w:szCs w:val="24"/>
+          <w:u w:val="single"/>
+        </w:rPr>
+        <w:t>)</w:t>
+      </w:r>
+    </w:p>
+    <w:p>
+      <w:pPr>
+        <w:pStyle w:val="9"/>
+        <w:ind w:left="780"/>
+        <w:jc w:val="left"/>
+        <w:rPr>
+          <w:rFonts w:eastAsiaTheme="majorEastAsia"/>
+          <w:sz w:val="22"/>
+          <w:szCs w:val="24"/>
+        </w:rPr>
+      </w:pPr>
+      <w:r>
+        <w:rPr>
+          <w:rFonts w:hint="eastAsia" w:eastAsiaTheme="majorEastAsia"/>
+          <w:kern w:val="0"/>
+          <w:sz w:val="22"/>
+          <w:szCs w:val="24"/>
+        </w:rPr>
+        <w:t>负责对接车联网大数据开发团队，搭建数据收集、分析、展示服务；</w:t>
+      </w:r>
+      <w:r>
+        <w:rPr>
+          <w:rFonts w:hint="eastAsia" w:eastAsiaTheme="majorEastAsia"/>
+          <w:sz w:val="22"/>
+          <w:szCs w:val="24"/>
+        </w:rPr>
+        <w:t>负责对接联合汽车电子各事业部工具和测试开发需求，负责项目交付。</w:t>
+      </w:r>
+    </w:p>
+    <w:bookmarkEnd w:id="4"/>
+    <w:p>
+      <w:pPr>
+        <w:pStyle w:val="9"/>
+        <w:numPr>
+          <w:ilvl w:val="0"/>
+          <w:numId w:val="7"/>
+        </w:numPr>
+        <w:jc w:val="left"/>
+        <w:rPr>
+          <w:rFonts w:eastAsiaTheme="majorEastAsia"/>
+          <w:sz w:val="22"/>
+          <w:szCs w:val="24"/>
+          <w:u w:val="single"/>
+        </w:rPr>
+      </w:pPr>
+      <w:r>
+        <w:rPr>
+          <w:rFonts w:hint="eastAsia" w:eastAsiaTheme="majorEastAsia"/>
+          <w:sz w:val="22"/>
+          <w:szCs w:val="24"/>
+          <w:u w:val="single"/>
+        </w:rPr>
+        <w:t>无锡博世车联网大数据项目接口人，开发成员(</w:t>
+      </w:r>
+      <w:r>
+        <w:rPr>
+          <w:rFonts w:eastAsiaTheme="majorEastAsia"/>
+          <w:sz w:val="22"/>
+          <w:szCs w:val="24"/>
+          <w:u w:val="single"/>
+        </w:rPr>
+        <w:t>Python, Vue.js, MQTT, Java, OSGi)</w:t>
+      </w:r>
+    </w:p>
+    <w:p>
+      <w:pPr>
+        <w:pStyle w:val="9"/>
+        <w:ind w:left="780"/>
+        <w:jc w:val="left"/>
+        <w:rPr>
+          <w:rFonts w:eastAsiaTheme="majorEastAsia"/>
+          <w:sz w:val="22"/>
+          <w:szCs w:val="24"/>
+        </w:rPr>
+      </w:pPr>
+      <w:r>
+        <w:rPr>
+          <w:rFonts w:hint="eastAsia" w:eastAsiaTheme="majorEastAsia"/>
+          <w:sz w:val="22"/>
+          <w:szCs w:val="24"/>
+        </w:rPr>
+        <w:t>作为项目接口人，负责车联网大数据云端开发需求，包括架构设计和代码编写，搭建了MQTT协议架构和PKI管理系统；参与设备端中间件软件设计和代码编写，基于OSGi框架。</w:t>
+      </w:r>
+    </w:p>
+    <w:p>
+      <w:pPr>
+        <w:pStyle w:val="9"/>
+        <w:ind w:left="780"/>
+        <w:jc w:val="left"/>
+        <w:rPr>
+          <w:rFonts w:eastAsiaTheme="majorEastAsia"/>
+          <w:sz w:val="22"/>
+          <w:szCs w:val="24"/>
+        </w:rPr>
+      </w:pPr>
+    </w:p>
+    <w:p>
+      <w:pPr>
+        <w:pStyle w:val="9"/>
+        <w:numPr>
+          <w:ilvl w:val="0"/>
+          <w:numId w:val="3"/>
+        </w:numPr>
+        <w:jc w:val="left"/>
+        <w:rPr>
+          <w:rFonts w:eastAsiaTheme="majorEastAsia"/>
+          <w:b/>
+          <w:sz w:val="22"/>
+          <w:szCs w:val="24"/>
+        </w:rPr>
+      </w:pPr>
+      <w:r>
+        <w:rPr>
+          <w:rFonts w:eastAsiaTheme="majorEastAsia"/>
+          <w:b/>
+          <w:sz w:val="22"/>
+          <w:szCs w:val="24"/>
+        </w:rPr>
+        <w:t xml:space="preserve">2018.05 – </w:t>
+      </w:r>
+      <w:r>
+        <w:rPr>
+          <w:rFonts w:hint="eastAsia" w:eastAsiaTheme="majorEastAsia"/>
+          <w:b/>
+          <w:sz w:val="22"/>
+          <w:szCs w:val="24"/>
+        </w:rPr>
+        <w:t>2020.</w:t>
+      </w:r>
+      <w:r>
+        <w:rPr>
+          <w:rFonts w:eastAsiaTheme="majorEastAsia"/>
+          <w:b/>
+          <w:sz w:val="22"/>
+          <w:szCs w:val="24"/>
+        </w:rPr>
+        <w:t>5</w:t>
+      </w:r>
+      <w:r>
+        <w:rPr>
+          <w:rFonts w:eastAsiaTheme="majorEastAsia"/>
+          <w:b/>
+          <w:sz w:val="22"/>
+          <w:szCs w:val="24"/>
+        </w:rPr>
+        <w:tab/>
+      </w:r>
+      <w:r>
+        <w:rPr>
+          <w:rFonts w:eastAsiaTheme="majorEastAsia"/>
+          <w:b/>
+          <w:sz w:val="22"/>
+          <w:szCs w:val="24"/>
+        </w:rPr>
+        <w:t>博世力士乐（常州）有限公司</w:t>
+      </w:r>
+      <w:r>
+        <w:rPr>
+          <w:rFonts w:eastAsiaTheme="majorEastAsia"/>
+          <w:b/>
+          <w:sz w:val="22"/>
+          <w:szCs w:val="24"/>
+        </w:rPr>
+        <w:tab/>
+      </w:r>
+      <w:r>
+        <w:rPr>
+          <w:rFonts w:eastAsiaTheme="majorEastAsia"/>
+          <w:b/>
+          <w:sz w:val="22"/>
+          <w:szCs w:val="24"/>
+        </w:rPr>
+        <w:t>Sr. Software Engineer</w:t>
+      </w:r>
+    </w:p>
+    <w:p>
+      <w:pPr>
+        <w:pStyle w:val="9"/>
+        <w:numPr>
+          <w:ilvl w:val="0"/>
+          <w:numId w:val="8"/>
+        </w:numPr>
+        <w:jc w:val="left"/>
+        <w:rPr>
+          <w:rFonts w:eastAsiaTheme="majorEastAsia"/>
+          <w:sz w:val="22"/>
+          <w:szCs w:val="24"/>
+          <w:u w:val="single"/>
+        </w:rPr>
+      </w:pPr>
+      <w:r>
+        <w:rPr>
+          <w:rFonts w:hint="eastAsia" w:eastAsiaTheme="majorEastAsia"/>
+          <w:sz w:val="22"/>
+          <w:szCs w:val="24"/>
+          <w:u w:val="single"/>
+        </w:rPr>
+        <w:t>基于UWB室内实时定位和博世生产系统的软件产品研发及测试系统搭建(</w:t>
+      </w:r>
+      <w:r>
+        <w:rPr>
+          <w:rFonts w:eastAsiaTheme="majorEastAsia"/>
+          <w:sz w:val="22"/>
+          <w:szCs w:val="24"/>
+          <w:u w:val="single"/>
+        </w:rPr>
+        <w:t>.NET, Python)</w:t>
+      </w:r>
+    </w:p>
+    <w:p>
+      <w:pPr>
+        <w:pStyle w:val="9"/>
+        <w:jc w:val="left"/>
+        <w:rPr>
+          <w:rFonts w:eastAsiaTheme="majorEastAsia"/>
+          <w:sz w:val="22"/>
+          <w:szCs w:val="24"/>
+        </w:rPr>
+      </w:pPr>
+      <w:r>
+        <w:rPr>
+          <w:rFonts w:hint="eastAsia" w:eastAsiaTheme="majorEastAsia"/>
+          <w:sz w:val="22"/>
+          <w:szCs w:val="24"/>
+        </w:rPr>
+        <w:t>作为核心成员，负责实时定位算法大数据处理及建模工作，并结合到博世生产系统。</w:t>
+      </w:r>
+    </w:p>
+    <w:p>
+      <w:pPr>
+        <w:pStyle w:val="9"/>
+        <w:numPr>
+          <w:ilvl w:val="0"/>
+          <w:numId w:val="8"/>
+        </w:numPr>
+        <w:jc w:val="left"/>
+        <w:rPr>
+          <w:rFonts w:eastAsiaTheme="majorEastAsia"/>
+          <w:sz w:val="22"/>
+          <w:szCs w:val="24"/>
+          <w:u w:val="single"/>
+        </w:rPr>
+      </w:pPr>
+      <w:r>
+        <w:rPr>
+          <w:rFonts w:hint="eastAsia" w:eastAsiaTheme="majorEastAsia"/>
+          <w:sz w:val="22"/>
+          <w:szCs w:val="24"/>
+          <w:u w:val="single"/>
+        </w:rPr>
+        <w:t>中德政府合作项目：基于3D实时定位的物流优化和碰撞规避(</w:t>
+      </w:r>
+      <w:r>
+        <w:rPr>
+          <w:rFonts w:eastAsiaTheme="majorEastAsia"/>
+          <w:sz w:val="22"/>
+          <w:szCs w:val="24"/>
+          <w:u w:val="single"/>
+        </w:rPr>
+        <w:t>.NET</w:t>
+      </w:r>
+      <w:r>
+        <w:rPr>
+          <w:rFonts w:hint="eastAsia" w:eastAsiaTheme="majorEastAsia"/>
+          <w:sz w:val="22"/>
+          <w:szCs w:val="24"/>
+          <w:u w:val="single"/>
+        </w:rPr>
+        <w:t>,</w:t>
+      </w:r>
+      <w:r>
+        <w:rPr>
+          <w:rFonts w:eastAsiaTheme="majorEastAsia"/>
+          <w:sz w:val="22"/>
+          <w:szCs w:val="24"/>
+          <w:u w:val="single"/>
+        </w:rPr>
+        <w:t xml:space="preserve"> Eclipse Mita, C)</w:t>
+      </w:r>
+    </w:p>
+    <w:p>
+      <w:pPr>
+        <w:pStyle w:val="9"/>
+        <w:jc w:val="left"/>
+        <w:rPr>
+          <w:rFonts w:eastAsiaTheme="majorEastAsia"/>
+          <w:sz w:val="22"/>
+          <w:szCs w:val="24"/>
+        </w:rPr>
+      </w:pPr>
+      <w:r>
+        <w:rPr>
+          <w:rFonts w:hint="eastAsia" w:eastAsiaTheme="majorEastAsia"/>
+          <w:sz w:val="22"/>
+          <w:szCs w:val="24"/>
+        </w:rPr>
+        <w:t>核心开发人员,</w:t>
+      </w:r>
+      <w:r>
+        <w:rPr>
+          <w:rFonts w:eastAsiaTheme="majorEastAsia"/>
+          <w:sz w:val="22"/>
+          <w:szCs w:val="24"/>
+        </w:rPr>
+        <w:t xml:space="preserve"> </w:t>
+      </w:r>
+      <w:r>
+        <w:rPr>
+          <w:rFonts w:hint="eastAsia" w:eastAsiaTheme="majorEastAsia"/>
+          <w:sz w:val="22"/>
+          <w:szCs w:val="24"/>
+        </w:rPr>
+        <w:t>负责基于IoT套件的机器大数据实时状态采集的软件产品研发。</w:t>
+      </w:r>
+    </w:p>
+    <w:p>
+      <w:pPr>
+        <w:pStyle w:val="9"/>
+        <w:jc w:val="left"/>
+        <w:rPr>
+          <w:rFonts w:eastAsiaTheme="majorEastAsia"/>
+          <w:sz w:val="22"/>
+          <w:szCs w:val="24"/>
+        </w:rPr>
+      </w:pPr>
+    </w:p>
+    <w:p>
+      <w:pPr>
+        <w:pStyle w:val="9"/>
+        <w:numPr>
+          <w:ilvl w:val="0"/>
+          <w:numId w:val="3"/>
+        </w:numPr>
+        <w:jc w:val="left"/>
+        <w:rPr>
+          <w:rFonts w:eastAsiaTheme="majorEastAsia"/>
+          <w:b/>
+          <w:sz w:val="22"/>
+          <w:szCs w:val="24"/>
+        </w:rPr>
+      </w:pPr>
+      <w:r>
+        <w:rPr>
+          <w:rFonts w:eastAsia="黑体"/>
+          <w:b/>
+          <w:sz w:val="22"/>
+          <w:szCs w:val="24"/>
+        </w:rPr>
+        <w:t>2014.07 – 2018.04</w:t>
+      </w:r>
+      <w:r>
+        <w:rPr>
+          <w:rFonts w:eastAsia="黑体"/>
+          <w:b/>
+          <w:sz w:val="22"/>
+          <w:szCs w:val="24"/>
+        </w:rPr>
+        <w:tab/>
+      </w:r>
+      <w:r>
+        <w:rPr>
+          <w:rFonts w:eastAsia="黑体"/>
+          <w:b/>
+          <w:sz w:val="22"/>
+          <w:szCs w:val="24"/>
+        </w:rPr>
+        <w:tab/>
+      </w:r>
+      <w:r>
+        <w:rPr>
+          <w:rFonts w:eastAsiaTheme="majorEastAsia"/>
+          <w:b/>
+          <w:sz w:val="22"/>
+          <w:szCs w:val="24"/>
+        </w:rPr>
+        <w:t xml:space="preserve">菲尼萨(Finisar)光电通讯科技（无锡） </w:t>
+      </w:r>
+      <w:r>
+        <w:rPr>
+          <w:rFonts w:eastAsia="黑体"/>
+          <w:b/>
+          <w:sz w:val="22"/>
+          <w:szCs w:val="24"/>
+        </w:rPr>
+        <w:t>Sr. Engineer</w:t>
+      </w:r>
+    </w:p>
+    <w:p>
+      <w:pPr>
+        <w:pStyle w:val="9"/>
+        <w:numPr>
+          <w:ilvl w:val="0"/>
+          <w:numId w:val="9"/>
+        </w:numPr>
+        <w:rPr>
+          <w:sz w:val="22"/>
+          <w:szCs w:val="24"/>
+          <w:u w:val="single"/>
+        </w:rPr>
+      </w:pPr>
+      <w:bookmarkStart w:id="5" w:name="OLE_LINK1"/>
+      <w:r>
+        <w:rPr>
+          <w:rFonts w:hint="eastAsia"/>
+          <w:sz w:val="22"/>
+          <w:szCs w:val="24"/>
+          <w:u w:val="single"/>
+        </w:rPr>
+        <w:t>基于生产大数据的质量监督系统开发 (.Net, R,</w:t>
+      </w:r>
+      <w:r>
+        <w:rPr>
+          <w:sz w:val="22"/>
+          <w:szCs w:val="24"/>
+          <w:u w:val="single"/>
+        </w:rPr>
+        <w:t xml:space="preserve"> FineUI, SQL</w:t>
+      </w:r>
+      <w:r>
+        <w:rPr>
+          <w:rFonts w:hint="eastAsia"/>
+          <w:sz w:val="22"/>
+          <w:szCs w:val="24"/>
+          <w:u w:val="single"/>
+        </w:rPr>
+        <w:t>)</w:t>
+      </w:r>
+    </w:p>
+    <w:p>
+      <w:pPr>
+        <w:pStyle w:val="9"/>
+        <w:rPr>
+          <w:sz w:val="22"/>
+          <w:szCs w:val="24"/>
+        </w:rPr>
+      </w:pPr>
+      <w:r>
+        <w:rPr>
+          <w:rFonts w:hint="eastAsia"/>
+          <w:sz w:val="22"/>
+          <w:szCs w:val="24"/>
+        </w:rPr>
+        <w:t>结合生产大数据和6Sigma理论，使用.</w:t>
+      </w:r>
+      <w:r>
+        <w:rPr>
+          <w:sz w:val="22"/>
+          <w:szCs w:val="24"/>
+        </w:rPr>
+        <w:t>NET</w:t>
+      </w:r>
+      <w:r>
+        <w:rPr>
+          <w:rFonts w:hint="eastAsia"/>
+          <w:sz w:val="22"/>
+          <w:szCs w:val="24"/>
+        </w:rPr>
+        <w:t>和R语言开发了诸如GRR,</w:t>
+      </w:r>
+      <w:r>
+        <w:rPr>
+          <w:sz w:val="22"/>
+          <w:szCs w:val="24"/>
+        </w:rPr>
+        <w:t xml:space="preserve"> SPC</w:t>
+      </w:r>
+      <w:r>
+        <w:rPr>
+          <w:rFonts w:hint="eastAsia"/>
+          <w:sz w:val="22"/>
+          <w:szCs w:val="24"/>
+        </w:rPr>
+        <w:t>和实时看板等质量监测工具与平台，实现了基于大数据的生产透明化。</w:t>
+      </w:r>
+    </w:p>
+    <w:p>
+      <w:pPr>
+        <w:pStyle w:val="9"/>
+        <w:numPr>
+          <w:ilvl w:val="0"/>
+          <w:numId w:val="9"/>
+        </w:numPr>
+        <w:rPr>
+          <w:sz w:val="22"/>
+          <w:szCs w:val="24"/>
+          <w:u w:val="single"/>
+        </w:rPr>
+      </w:pPr>
+      <w:r>
+        <w:rPr>
+          <w:sz w:val="22"/>
+          <w:szCs w:val="24"/>
+          <w:u w:val="single"/>
+        </w:rPr>
+        <w:t>光模块测试系统软件开发</w:t>
+      </w:r>
+      <w:r>
+        <w:rPr>
+          <w:rFonts w:hint="eastAsia"/>
+          <w:sz w:val="22"/>
+          <w:szCs w:val="24"/>
+          <w:u w:val="single"/>
+        </w:rPr>
+        <w:t>及软件测试平台本地化维护(</w:t>
+      </w:r>
+      <w:r>
+        <w:rPr>
+          <w:sz w:val="22"/>
+          <w:szCs w:val="24"/>
+          <w:u w:val="single"/>
+        </w:rPr>
+        <w:t>.NET, Labwindows CVI)</w:t>
+      </w:r>
+    </w:p>
+    <w:p>
+      <w:pPr>
+        <w:pStyle w:val="9"/>
+        <w:rPr>
+          <w:sz w:val="22"/>
+          <w:szCs w:val="24"/>
+        </w:rPr>
+      </w:pPr>
+      <w:r>
+        <w:rPr>
+          <w:rFonts w:hint="eastAsia"/>
+          <w:sz w:val="22"/>
+          <w:szCs w:val="24"/>
+        </w:rPr>
+        <w:t>定制化光模块测试工序软件开发</w:t>
+      </w:r>
+      <w:r>
+        <w:rPr>
+          <w:sz w:val="22"/>
+          <w:szCs w:val="24"/>
+        </w:rPr>
+        <w:t>，进行</w:t>
+      </w:r>
+      <w:r>
+        <w:rPr>
+          <w:rFonts w:hint="eastAsia"/>
+          <w:sz w:val="22"/>
+          <w:szCs w:val="24"/>
+        </w:rPr>
+        <w:t>测试大</w:t>
+      </w:r>
+      <w:r>
+        <w:rPr>
+          <w:sz w:val="22"/>
+          <w:szCs w:val="24"/>
+        </w:rPr>
+        <w:t>数据</w:t>
+      </w:r>
+      <w:r>
+        <w:rPr>
+          <w:rFonts w:hint="eastAsia"/>
+          <w:sz w:val="22"/>
+          <w:szCs w:val="24"/>
+        </w:rPr>
+        <w:t>采集、算法验证等</w:t>
+      </w:r>
+      <w:r>
+        <w:rPr>
+          <w:sz w:val="22"/>
+          <w:szCs w:val="24"/>
+        </w:rPr>
+        <w:t>。作为沟通窗口负责</w:t>
+      </w:r>
+      <w:r>
+        <w:rPr>
+          <w:rFonts w:hint="eastAsia"/>
+          <w:sz w:val="22"/>
+          <w:szCs w:val="24"/>
+        </w:rPr>
+        <w:t>与美国分公司进行生产大</w:t>
+      </w:r>
+      <w:r>
+        <w:rPr>
+          <w:sz w:val="22"/>
+          <w:szCs w:val="24"/>
+        </w:rPr>
+        <w:t>数据转移及测试维护等，</w:t>
+      </w:r>
+      <w:r>
+        <w:rPr>
+          <w:rFonts w:hint="eastAsia"/>
+          <w:sz w:val="22"/>
+          <w:szCs w:val="24"/>
+        </w:rPr>
+        <w:t>与马来西亚开发团队进行本地化维护与配置</w:t>
+      </w:r>
+      <w:r>
+        <w:rPr>
+          <w:sz w:val="22"/>
+          <w:szCs w:val="24"/>
+        </w:rPr>
+        <w:t>等。</w:t>
+      </w:r>
+    </w:p>
+    <w:bookmarkEnd w:id="5"/>
+    <w:p>
+      <w:pPr>
+        <w:pStyle w:val="9"/>
+        <w:rPr>
+          <w:sz w:val="22"/>
+          <w:szCs w:val="24"/>
+        </w:rPr>
+      </w:pPr>
+    </w:p>
+    <w:p>
+      <w:pPr>
+        <w:pStyle w:val="9"/>
+        <w:rPr>
+          <w:sz w:val="22"/>
+          <w:szCs w:val="24"/>
+        </w:rPr>
+      </w:pPr>
+    </w:p>
+    <w:p>
+      <w:pPr>
+        <w:pStyle w:val="9"/>
+        <w:rPr>
+          <w:sz w:val="22"/>
+          <w:szCs w:val="24"/>
+        </w:rPr>
+      </w:pPr>
+    </w:p>
+    <w:p>
+      <w:pPr>
+        <w:pStyle w:val="9"/>
+        <w:rPr>
+          <w:sz w:val="22"/>
+          <w:szCs w:val="24"/>
+        </w:rPr>
+      </w:pPr>
+    </w:p>
+    <w:p>
+      <w:pPr>
+        <w:pStyle w:val="9"/>
+        <w:rPr>
+          <w:sz w:val="22"/>
+          <w:szCs w:val="24"/>
+        </w:rPr>
+      </w:pPr>
+    </w:p>
+    <w:p>
+      <w:pPr>
+        <w:pStyle w:val="9"/>
+        <w:rPr>
+          <w:sz w:val="22"/>
+          <w:szCs w:val="24"/>
+        </w:rPr>
+      </w:pPr>
+    </w:p>
+    <w:p>
+      <w:pPr>
+        <w:pStyle w:val="9"/>
+        <w:rPr>
+          <w:sz w:val="22"/>
+          <w:szCs w:val="24"/>
+        </w:rPr>
+      </w:pPr>
+    </w:p>
+    <w:p>
+      <w:pPr>
+        <w:pStyle w:val="9"/>
+        <w:rPr>
+          <w:sz w:val="22"/>
+          <w:szCs w:val="24"/>
+        </w:rPr>
+      </w:pPr>
+    </w:p>
+    <w:p>
+      <w:pPr>
+        <w:pStyle w:val="9"/>
+        <w:rPr>
+          <w:sz w:val="22"/>
+          <w:szCs w:val="24"/>
+        </w:rPr>
+      </w:pPr>
+    </w:p>
+    <w:p>
+      <w:pPr>
+        <w:pStyle w:val="9"/>
+        <w:rPr>
+          <w:sz w:val="22"/>
+          <w:szCs w:val="24"/>
+        </w:rPr>
+      </w:pPr>
+    </w:p>
+    <w:p>
+      <w:pPr>
+        <w:pStyle w:val="9"/>
+        <w:rPr>
+          <w:sz w:val="22"/>
+          <w:szCs w:val="24"/>
+        </w:rPr>
+      </w:pPr>
+    </w:p>
+    <w:p>
+      <w:pPr>
+        <w:pStyle w:val="9"/>
+        <w:rPr>
+          <w:sz w:val="22"/>
+          <w:szCs w:val="24"/>
+        </w:rPr>
+      </w:pPr>
+    </w:p>
+    <w:p>
+      <w:pPr>
+        <w:pStyle w:val="9"/>
+        <w:rPr>
+          <w:sz w:val="22"/>
+          <w:szCs w:val="24"/>
+        </w:rPr>
+      </w:pPr>
+    </w:p>
+    <w:p>
+      <w:pPr>
+        <w:pStyle w:val="9"/>
+        <w:rPr>
+          <w:sz w:val="22"/>
+          <w:szCs w:val="24"/>
+        </w:rPr>
+      </w:pPr>
+    </w:p>
+    <w:p>
+      <w:pPr>
+        <w:pStyle w:val="9"/>
+        <w:jc w:val="center"/>
+        <w:rPr>
+          <w:sz w:val="22"/>
+          <w:szCs w:val="24"/>
+        </w:rPr>
+      </w:pPr>
+      <w:r>
+        <w:rPr>
+          <w:sz w:val="22"/>
+          <w:szCs w:val="24"/>
+        </w:rPr>
+        <w:t>Yang Shaopeng</w:t>
+      </w:r>
+    </w:p>
+    <w:p>
+      <w:pPr>
+        <w:pStyle w:val="9"/>
+        <w:rPr>
+          <w:sz w:val="22"/>
+          <w:szCs w:val="24"/>
+        </w:rPr>
+      </w:pPr>
+    </w:p>
+    <w:p>
+      <w:pPr>
+        <w:pStyle w:val="9"/>
+        <w:rPr>
+          <w:b/>
+          <w:bCs/>
+          <w:sz w:val="22"/>
+          <w:szCs w:val="24"/>
+        </w:rPr>
+      </w:pPr>
+      <w:r>
+        <w:rPr>
+          <w:b/>
+          <w:bCs/>
+          <w:sz w:val="22"/>
+          <w:szCs w:val="24"/>
+        </w:rPr>
+        <w:t>Personal Information:</w:t>
+      </w:r>
+    </w:p>
+    <w:p>
+      <w:pPr>
+        <w:pStyle w:val="9"/>
+        <w:numPr>
+          <w:ilvl w:val="0"/>
+          <w:numId w:val="10"/>
+        </w:numPr>
+        <w:rPr>
+          <w:sz w:val="22"/>
+          <w:szCs w:val="24"/>
+        </w:rPr>
+      </w:pPr>
+      <w:r>
+        <w:rPr>
+          <w:sz w:val="22"/>
+          <w:szCs w:val="24"/>
+        </w:rPr>
+        <w:t>Basic Info: Male | Date of Birth: Mar 1989 | Registered Residence: Wuxi, Jiangsu</w:t>
+      </w:r>
+    </w:p>
+    <w:p>
+      <w:pPr>
+        <w:pStyle w:val="9"/>
+        <w:numPr>
+          <w:ilvl w:val="0"/>
+          <w:numId w:val="10"/>
+        </w:numPr>
+        <w:rPr>
+          <w:sz w:val="22"/>
+          <w:szCs w:val="24"/>
+          <w:lang w:val="fr-FR"/>
+        </w:rPr>
+      </w:pPr>
+      <w:r>
+        <w:rPr>
+          <w:sz w:val="22"/>
+          <w:szCs w:val="24"/>
+          <w:lang w:val="fr-FR"/>
+        </w:rPr>
+        <w:t>Contact: +86 18262273079 | Email: youngtopsky@163.com</w:t>
+      </w:r>
+    </w:p>
+    <w:p>
+      <w:pPr>
+        <w:pStyle w:val="9"/>
+        <w:numPr>
+          <w:ilvl w:val="0"/>
+          <w:numId w:val="10"/>
+        </w:numPr>
+        <w:rPr>
+          <w:sz w:val="22"/>
+          <w:szCs w:val="24"/>
+          <w:lang w:val="fr-FR"/>
+        </w:rPr>
+      </w:pPr>
+      <w:r>
+        <w:rPr>
+          <w:sz w:val="22"/>
+          <w:szCs w:val="24"/>
+          <w:lang w:val="fr-FR"/>
+        </w:rPr>
+        <w:t>Education:</w:t>
+      </w:r>
+    </w:p>
+    <w:p>
+      <w:pPr>
+        <w:pStyle w:val="9"/>
+        <w:numPr>
+          <w:ilvl w:val="1"/>
+          <w:numId w:val="10"/>
+        </w:numPr>
+        <w:rPr>
+          <w:sz w:val="22"/>
+          <w:szCs w:val="24"/>
+        </w:rPr>
+      </w:pPr>
+      <w:r>
+        <w:rPr>
+          <w:sz w:val="22"/>
+          <w:szCs w:val="24"/>
+        </w:rPr>
+        <w:t>Master's Degree (Electronic and Communication Engineering), Jiangnan University, 2014</w:t>
+      </w:r>
+    </w:p>
+    <w:p>
+      <w:pPr>
+        <w:pStyle w:val="9"/>
+        <w:numPr>
+          <w:ilvl w:val="1"/>
+          <w:numId w:val="10"/>
+        </w:numPr>
+        <w:rPr>
+          <w:sz w:val="22"/>
+          <w:szCs w:val="24"/>
+        </w:rPr>
+      </w:pPr>
+      <w:r>
+        <w:rPr>
+          <w:sz w:val="22"/>
+          <w:szCs w:val="24"/>
+        </w:rPr>
+        <w:t>Bachelor's Degree (Electronic Information Engineering), Jiangnan University, 2011</w:t>
+      </w:r>
+    </w:p>
+    <w:p>
+      <w:pPr>
+        <w:pStyle w:val="9"/>
+        <w:rPr>
+          <w:sz w:val="22"/>
+          <w:szCs w:val="24"/>
+        </w:rPr>
+      </w:pPr>
+    </w:p>
+    <w:p>
+      <w:pPr>
+        <w:pStyle w:val="9"/>
+        <w:rPr>
+          <w:b/>
+          <w:bCs/>
+          <w:sz w:val="22"/>
+          <w:szCs w:val="24"/>
+        </w:rPr>
+      </w:pPr>
+      <w:r>
+        <w:rPr>
+          <w:b/>
+          <w:bCs/>
+          <w:sz w:val="22"/>
+          <w:szCs w:val="24"/>
+        </w:rPr>
+        <w:t>Professional Summary:</w:t>
+      </w:r>
+    </w:p>
+    <w:p>
+      <w:pPr>
+        <w:pStyle w:val="9"/>
+        <w:numPr>
+          <w:ilvl w:val="0"/>
+          <w:numId w:val="11"/>
+        </w:numPr>
+        <w:rPr>
+          <w:sz w:val="22"/>
+          <w:szCs w:val="24"/>
+        </w:rPr>
+      </w:pPr>
+      <w:r>
+        <w:rPr>
+          <w:sz w:val="22"/>
+          <w:szCs w:val="24"/>
+        </w:rPr>
+        <w:t>10+ Years Cross-Domain Experience: Encompassing Industrial IoT (IIoT), Big Data, and Machine Learning/LLM applications, proficient in the full Cloud-Pipe-Device stack.</w:t>
+      </w:r>
+    </w:p>
+    <w:p>
+      <w:pPr>
+        <w:pStyle w:val="9"/>
+        <w:numPr>
+          <w:ilvl w:val="0"/>
+          <w:numId w:val="11"/>
+        </w:numPr>
+        <w:rPr>
+          <w:sz w:val="22"/>
+          <w:szCs w:val="24"/>
+        </w:rPr>
+      </w:pPr>
+      <w:r>
+        <w:rPr>
+          <w:sz w:val="22"/>
+          <w:szCs w:val="24"/>
+        </w:rPr>
+        <w:t>Technology Integration Skills: Combines software/hardware development (Python/Java/.NET, Edge Linux), data analysis (SQL/R), and project management (Siemens Certified Project Manager).</w:t>
+      </w:r>
+    </w:p>
+    <w:p>
+      <w:pPr>
+        <w:pStyle w:val="9"/>
+        <w:numPr>
+          <w:ilvl w:val="0"/>
+          <w:numId w:val="11"/>
+        </w:numPr>
+        <w:rPr>
+          <w:sz w:val="22"/>
+          <w:szCs w:val="24"/>
+        </w:rPr>
+      </w:pPr>
+      <w:r>
+        <w:rPr>
+          <w:sz w:val="22"/>
+          <w:szCs w:val="24"/>
+        </w:rPr>
+        <w:t>Industry Practice: Deeply involved in digital solutions for semiconductor &amp; optical communication manufacturing/test development, automotive manufacturing &amp; software (Telematics, Predictive Maintenance, Catena-X Data Space), healthcare, energy, etc. Holds multiple patents and has experience delivering multinational projects.</w:t>
+      </w:r>
+    </w:p>
+    <w:p>
+      <w:pPr>
+        <w:pStyle w:val="9"/>
+        <w:numPr>
+          <w:ilvl w:val="0"/>
+          <w:numId w:val="11"/>
+        </w:numPr>
+        <w:rPr>
+          <w:sz w:val="22"/>
+          <w:szCs w:val="24"/>
+        </w:rPr>
+      </w:pPr>
+      <w:r>
+        <w:rPr>
+          <w:sz w:val="22"/>
+          <w:szCs w:val="24"/>
+        </w:rPr>
+        <w:t>Language: Fluent in English (Cambridge BEC Higher, TOEIC 980), with experience in multinational collaboration and technical presentations.</w:t>
+      </w:r>
+    </w:p>
+    <w:p>
+      <w:pPr>
+        <w:pStyle w:val="9"/>
+        <w:rPr>
+          <w:sz w:val="22"/>
+          <w:szCs w:val="24"/>
+        </w:rPr>
+      </w:pPr>
+    </w:p>
+    <w:p>
+      <w:pPr>
+        <w:pStyle w:val="9"/>
+        <w:rPr>
+          <w:b/>
+          <w:bCs/>
+          <w:sz w:val="22"/>
+          <w:szCs w:val="24"/>
+        </w:rPr>
+      </w:pPr>
+      <w:r>
+        <w:rPr>
+          <w:b/>
+          <w:bCs/>
+          <w:sz w:val="22"/>
+          <w:szCs w:val="24"/>
+        </w:rPr>
+        <w:t>Work &amp; Project Experience:</w:t>
+      </w:r>
+    </w:p>
+    <w:p>
+      <w:pPr>
+        <w:pStyle w:val="9"/>
+        <w:rPr>
+          <w:b/>
+          <w:bCs/>
+          <w:sz w:val="22"/>
+          <w:szCs w:val="24"/>
+        </w:rPr>
+      </w:pPr>
+      <w:r>
+        <w:rPr>
+          <w:rFonts w:ascii="Segoe UI Symbol" w:hAnsi="Segoe UI Symbol" w:cs="Segoe UI Symbol"/>
+          <w:b/>
+          <w:bCs/>
+          <w:sz w:val="22"/>
+          <w:szCs w:val="24"/>
+        </w:rPr>
+        <w:t>➤</w:t>
+      </w:r>
+      <w:r>
+        <w:rPr>
+          <w:b/>
+          <w:bCs/>
+          <w:sz w:val="22"/>
+          <w:szCs w:val="24"/>
+        </w:rPr>
+        <w:t xml:space="preserve"> 202</w:t>
+      </w:r>
+      <w:r>
+        <w:rPr>
+          <w:rFonts w:hint="eastAsia"/>
+          <w:b/>
+          <w:bCs/>
+          <w:sz w:val="22"/>
+          <w:szCs w:val="24"/>
+          <w:lang w:val="en-US" w:eastAsia="zh-CN"/>
+        </w:rPr>
+        <w:t>5.12</w:t>
+      </w:r>
+      <w:r>
+        <w:rPr>
+          <w:b/>
+          <w:bCs/>
+          <w:sz w:val="22"/>
+          <w:szCs w:val="24"/>
+        </w:rPr>
+        <w:t xml:space="preserve"> – Present | Eli Lilly Suzhou Pharmaceutical Co., Ltd. | Senior Principal Engineer</w:t>
+      </w:r>
+    </w:p>
+    <w:p>
+      <w:pPr>
+        <w:pStyle w:val="9"/>
+        <w:numPr>
+          <w:ilvl w:val="0"/>
+          <w:numId w:val="12"/>
+        </w:numPr>
+        <w:rPr>
+          <w:rFonts w:hint="eastAsia"/>
+          <w:sz w:val="22"/>
+          <w:szCs w:val="24"/>
+        </w:rPr>
+      </w:pPr>
+      <w:r>
+        <w:rPr>
+          <w:rFonts w:hint="eastAsia"/>
+          <w:sz w:val="22"/>
+          <w:szCs w:val="24"/>
+        </w:rPr>
+        <w:t>Lead of AI Applications, Data Science &amp; Digitalization</w:t>
+      </w:r>
+    </w:p>
+    <w:p>
+      <w:pPr>
+        <w:pStyle w:val="9"/>
+        <w:ind w:leftChars="700"/>
+        <w:rPr>
+          <w:rFonts w:hint="eastAsia"/>
+          <w:b w:val="0"/>
+          <w:bCs w:val="0"/>
+          <w:sz w:val="22"/>
+          <w:szCs w:val="24"/>
+        </w:rPr>
+      </w:pPr>
+      <w:r>
+        <w:rPr>
+          <w:rFonts w:hint="eastAsia"/>
+          <w:b w:val="0"/>
+          <w:bCs w:val="0"/>
+          <w:sz w:val="22"/>
+          <w:szCs w:val="24"/>
+        </w:rPr>
+        <w:t>Le</w:t>
+      </w:r>
+      <w:r>
+        <w:rPr>
+          <w:rFonts w:hint="eastAsia"/>
+          <w:b w:val="0"/>
+          <w:bCs w:val="0"/>
+          <w:sz w:val="22"/>
+          <w:szCs w:val="24"/>
+          <w:lang w:val="en-US" w:eastAsia="zh-CN"/>
+        </w:rPr>
+        <w:t>a</w:t>
+      </w:r>
+      <w:r>
+        <w:rPr>
+          <w:rFonts w:hint="eastAsia"/>
+          <w:b w:val="0"/>
+          <w:bCs w:val="0"/>
+          <w:sz w:val="22"/>
+          <w:szCs w:val="24"/>
+        </w:rPr>
+        <w:t>d digital transformation initiatives for the manufacturing site, focusing on the rollout of cutting-edge digital technologies and Lilly</w:t>
+      </w:r>
+      <w:r>
+        <w:rPr>
+          <w:rFonts w:hint="default"/>
+          <w:b w:val="0"/>
+          <w:bCs w:val="0"/>
+          <w:sz w:val="22"/>
+          <w:szCs w:val="24"/>
+          <w:lang w:val="en-US" w:eastAsia="zh-CN"/>
+        </w:rPr>
+        <w:t>’</w:t>
+      </w:r>
+      <w:r>
+        <w:rPr>
+          <w:rFonts w:hint="eastAsia"/>
+          <w:b w:val="0"/>
+          <w:bCs w:val="0"/>
+          <w:sz w:val="22"/>
+          <w:szCs w:val="24"/>
+        </w:rPr>
+        <w:t>s global digital solutions at</w:t>
+      </w:r>
+      <w:r>
+        <w:rPr>
+          <w:rFonts w:hint="eastAsia"/>
+          <w:b w:val="0"/>
+          <w:bCs w:val="0"/>
+          <w:sz w:val="22"/>
+          <w:szCs w:val="24"/>
+          <w:lang w:val="en-US" w:eastAsia="zh-CN"/>
+        </w:rPr>
+        <w:t xml:space="preserve"> </w:t>
+      </w:r>
+      <w:r>
+        <w:rPr>
+          <w:rFonts w:hint="eastAsia"/>
+          <w:b w:val="0"/>
+          <w:bCs w:val="0"/>
+          <w:sz w:val="22"/>
+          <w:szCs w:val="24"/>
+        </w:rPr>
+        <w:t>Suzhou plant. Responsibilities cover</w:t>
+      </w:r>
+      <w:r>
+        <w:rPr>
+          <w:rFonts w:hint="eastAsia"/>
+          <w:b w:val="0"/>
+          <w:bCs w:val="0"/>
+          <w:sz w:val="22"/>
+          <w:szCs w:val="24"/>
+          <w:lang w:val="en-US" w:eastAsia="zh-CN"/>
+        </w:rPr>
+        <w:t>ing</w:t>
+      </w:r>
+      <w:r>
+        <w:rPr>
+          <w:rFonts w:hint="eastAsia"/>
+          <w:b w:val="0"/>
+          <w:bCs w:val="0"/>
+          <w:sz w:val="22"/>
+          <w:szCs w:val="24"/>
+        </w:rPr>
+        <w:t xml:space="preserve"> implementation of digital systems </w:t>
+      </w:r>
+      <w:r>
+        <w:rPr>
+          <w:rFonts w:hint="eastAsia"/>
+          <w:b w:val="0"/>
+          <w:bCs w:val="0"/>
+          <w:sz w:val="22"/>
+          <w:szCs w:val="24"/>
+          <w:lang w:val="en-US" w:eastAsia="zh-CN"/>
+        </w:rPr>
+        <w:t>and</w:t>
+      </w:r>
+      <w:r>
+        <w:rPr>
+          <w:rFonts w:hint="eastAsia"/>
+          <w:b w:val="0"/>
+          <w:bCs w:val="0"/>
+          <w:sz w:val="22"/>
+          <w:szCs w:val="24"/>
+        </w:rPr>
+        <w:t xml:space="preserve"> advanced data analytics, artificial intelligence (machine learning, large language models, AI Agents), and Internet of Things (IoT)</w:t>
+      </w:r>
+      <w:r>
+        <w:rPr>
+          <w:rFonts w:hint="eastAsia"/>
+          <w:b w:val="0"/>
+          <w:bCs w:val="0"/>
+          <w:sz w:val="22"/>
+          <w:szCs w:val="24"/>
+          <w:lang w:val="en-US" w:eastAsia="zh-CN"/>
+        </w:rPr>
+        <w:t>, robotic solutions</w:t>
+      </w:r>
+      <w:r>
+        <w:rPr>
+          <w:rFonts w:hint="eastAsia"/>
+          <w:b w:val="0"/>
+          <w:bCs w:val="0"/>
+          <w:sz w:val="22"/>
+          <w:szCs w:val="24"/>
+        </w:rPr>
+        <w:t>.</w:t>
+      </w:r>
+    </w:p>
+    <w:p>
+      <w:pPr>
+        <w:pStyle w:val="9"/>
+        <w:numPr>
+          <w:ilvl w:val="0"/>
+          <w:numId w:val="12"/>
+        </w:numPr>
+        <w:rPr>
+          <w:rFonts w:hint="eastAsia"/>
+          <w:sz w:val="22"/>
+          <w:szCs w:val="24"/>
+        </w:rPr>
+      </w:pPr>
+      <w:r>
+        <w:rPr>
+          <w:rFonts w:hint="eastAsia"/>
+          <w:sz w:val="22"/>
+          <w:szCs w:val="24"/>
+        </w:rPr>
+        <w:t>AI &amp; Digitalization Demand Analyst &amp; Solution Architect</w:t>
+      </w:r>
+    </w:p>
+    <w:p>
+      <w:pPr>
+        <w:pStyle w:val="9"/>
+        <w:ind w:leftChars="700"/>
+        <w:rPr>
+          <w:b w:val="0"/>
+          <w:bCs w:val="0"/>
+          <w:sz w:val="22"/>
+          <w:szCs w:val="24"/>
+        </w:rPr>
+      </w:pPr>
+      <w:r>
+        <w:rPr>
+          <w:rFonts w:hint="eastAsia"/>
+          <w:b w:val="0"/>
+          <w:bCs w:val="0"/>
+          <w:sz w:val="22"/>
+          <w:szCs w:val="24"/>
+        </w:rPr>
+        <w:t>Collaborate</w:t>
       </w:r>
       <w:bookmarkStart w:id="6" w:name="_GoBack"/>
       <w:bookmarkEnd w:id="6"/>
       <w:r>
         <w:rPr>
-          <w:rFonts w:hint="eastAsia" w:asciiTheme="majorEastAsia" w:hAnsiTheme="majorEastAsia" w:eastAsiaTheme="majorEastAsia"/>
-          <w:bCs/>
-          <w:sz w:val="22"/>
-          <w:szCs w:val="24"/>
-          <w:lang w:val="en-US" w:eastAsia="zh-CN"/>
-        </w:rPr>
-        <w:t>)，物联网相关的数字化方案实施。</w:t>
-      </w:r>
-    </w:p>
-    <w:p>
-      <w:pPr>
-        <w:pStyle w:val="9"/>
-        <w:numPr>
-          <w:ilvl w:val="0"/>
-          <w:numId w:val="4"/>
-        </w:numPr>
-        <w:ind w:left="786" w:leftChars="0" w:hanging="360" w:firstLineChars="0"/>
-        <w:jc w:val="left"/>
-        <w:rPr>
-          <w:rFonts w:hint="default" w:asciiTheme="majorEastAsia" w:hAnsiTheme="majorEastAsia" w:eastAsiaTheme="majorEastAsia"/>
-          <w:bCs/>
-          <w:sz w:val="22"/>
-          <w:szCs w:val="24"/>
-          <w:u w:val="single"/>
-          <w:lang w:val="en-US" w:eastAsia="zh-CN"/>
-        </w:rPr>
-      </w:pPr>
-      <w:r>
-        <w:rPr>
-          <w:rFonts w:hint="eastAsia" w:asciiTheme="majorEastAsia" w:hAnsiTheme="majorEastAsia" w:eastAsiaTheme="majorEastAsia"/>
-          <w:bCs/>
-          <w:sz w:val="22"/>
-          <w:szCs w:val="24"/>
-          <w:u w:val="single"/>
-          <w:lang w:val="en-US" w:eastAsia="zh-CN"/>
-        </w:rPr>
-        <w:t>AI及数字化需求分析师和架构师</w:t>
-      </w:r>
-    </w:p>
-    <w:p>
-      <w:pPr>
-        <w:pStyle w:val="9"/>
-        <w:ind w:left="786"/>
-        <w:jc w:val="left"/>
-        <w:rPr>
-          <w:rFonts w:hint="default" w:asciiTheme="majorEastAsia" w:hAnsiTheme="majorEastAsia" w:eastAsiaTheme="majorEastAsia"/>
-          <w:bCs/>
-          <w:sz w:val="22"/>
-          <w:szCs w:val="24"/>
-          <w:lang w:val="en-US" w:eastAsia="zh-CN"/>
-        </w:rPr>
-      </w:pPr>
-      <w:r>
-        <w:rPr>
-          <w:rFonts w:hint="eastAsia" w:asciiTheme="majorEastAsia" w:hAnsiTheme="majorEastAsia" w:eastAsiaTheme="majorEastAsia"/>
-          <w:bCs/>
-          <w:sz w:val="22"/>
-          <w:szCs w:val="24"/>
-          <w:lang w:val="en-US" w:eastAsia="zh-CN"/>
-        </w:rPr>
-        <w:t>深入与工厂和全球不同功能组织的深入沟通，总结归纳用户需求，调研市场解决方案，提供可行</w:t>
-      </w:r>
-      <w:r>
-        <w:rPr>
-          <w:rFonts w:hint="eastAsia" w:asciiTheme="majorEastAsia" w:hAnsiTheme="majorEastAsia" w:eastAsiaTheme="majorEastAsia"/>
-          <w:bCs/>
-          <w:sz w:val="22"/>
-          <w:szCs w:val="24"/>
-          <w:lang w:val="en-US" w:eastAsia="zh-CN"/>
-        </w:rPr>
-        <w:tab/>
-        <w:t>的技术方案及架构，并负责实施。</w:t>
-      </w:r>
-    </w:p>
-    <w:p>
-      <w:pPr>
-        <w:pStyle w:val="9"/>
-        <w:numPr>
-          <w:numId w:val="0"/>
-        </w:numPr>
-        <w:ind w:leftChars="0"/>
-        <w:jc w:val="left"/>
-        <w:rPr>
-          <w:rFonts w:hint="default" w:eastAsiaTheme="majorEastAsia"/>
-          <w:b/>
-          <w:sz w:val="22"/>
-          <w:szCs w:val="24"/>
-          <w:lang w:val="en-US"/>
-        </w:rPr>
-      </w:pPr>
-    </w:p>
-    <w:p>
-      <w:pPr>
-        <w:pStyle w:val="9"/>
-        <w:numPr>
-          <w:ilvl w:val="0"/>
-          <w:numId w:val="3"/>
-        </w:numPr>
-        <w:jc w:val="left"/>
-        <w:rPr>
-          <w:rFonts w:eastAsiaTheme="majorEastAsia"/>
-          <w:b/>
-          <w:sz w:val="22"/>
-          <w:szCs w:val="24"/>
-        </w:rPr>
-      </w:pPr>
-      <w:r>
-        <w:rPr>
-          <w:rFonts w:eastAsiaTheme="majorEastAsia"/>
-          <w:b/>
-          <w:sz w:val="22"/>
-          <w:szCs w:val="24"/>
-        </w:rPr>
-        <w:t>2021.06 -</w:t>
-      </w:r>
-      <w:r>
-        <w:rPr>
-          <w:rFonts w:hint="eastAsia" w:eastAsiaTheme="majorEastAsia"/>
-          <w:b/>
-          <w:sz w:val="22"/>
-          <w:szCs w:val="24"/>
-          <w:lang w:val="en-US" w:eastAsia="zh-CN"/>
-        </w:rPr>
-        <w:t xml:space="preserve"> 2025.11</w:t>
-      </w:r>
-      <w:r>
-        <w:rPr>
-          <w:rFonts w:eastAsiaTheme="majorEastAsia"/>
-          <w:b/>
-          <w:sz w:val="22"/>
-          <w:szCs w:val="24"/>
-        </w:rPr>
-        <w:tab/>
-      </w:r>
-      <w:r>
-        <w:rPr>
-          <w:rFonts w:hint="eastAsia" w:eastAsiaTheme="majorEastAsia"/>
-          <w:b/>
-          <w:sz w:val="22"/>
-          <w:szCs w:val="24"/>
-        </w:rPr>
-        <w:t>西门子（中国）有限公司无锡创新中心</w:t>
-      </w:r>
-      <w:r>
-        <w:rPr>
-          <w:rFonts w:eastAsiaTheme="majorEastAsia"/>
-          <w:b/>
-          <w:sz w:val="22"/>
-          <w:szCs w:val="24"/>
-        </w:rPr>
-        <w:tab/>
-      </w:r>
-      <w:r>
-        <w:rPr>
-          <w:rFonts w:eastAsiaTheme="majorEastAsia"/>
-          <w:b/>
-          <w:sz w:val="22"/>
-          <w:szCs w:val="24"/>
-        </w:rPr>
-        <w:t xml:space="preserve"> </w:t>
-      </w:r>
-      <w:r>
-        <w:rPr>
-          <w:rFonts w:hint="eastAsia" w:eastAsiaTheme="majorEastAsia"/>
-          <w:b/>
-          <w:sz w:val="22"/>
-          <w:szCs w:val="24"/>
-        </w:rPr>
-        <w:t>专家工程师</w:t>
-      </w:r>
-      <w:r>
-        <w:rPr>
-          <w:rFonts w:hint="eastAsia" w:eastAsiaTheme="majorEastAsia"/>
-          <w:b/>
-          <w:sz w:val="22"/>
-          <w:szCs w:val="24"/>
-          <w:lang w:val="en-US" w:eastAsia="zh-CN"/>
-        </w:rPr>
-        <w:t xml:space="preserve"> Expert Engineer</w:t>
-      </w:r>
-    </w:p>
-    <w:p>
-      <w:pPr>
-        <w:pStyle w:val="9"/>
-        <w:numPr>
-          <w:ilvl w:val="0"/>
-          <w:numId w:val="5"/>
-        </w:numPr>
-        <w:ind w:left="426" w:leftChars="0"/>
-        <w:jc w:val="left"/>
-        <w:rPr>
-          <w:rFonts w:asciiTheme="majorEastAsia" w:hAnsiTheme="majorEastAsia" w:eastAsiaTheme="majorEastAsia"/>
-          <w:bCs/>
-          <w:sz w:val="22"/>
-          <w:szCs w:val="24"/>
-          <w:u w:val="single"/>
-        </w:rPr>
-      </w:pPr>
-      <w:r>
-        <w:rPr>
-          <w:rFonts w:hint="eastAsia" w:asciiTheme="majorEastAsia" w:hAnsiTheme="majorEastAsia" w:eastAsiaTheme="majorEastAsia"/>
-          <w:bCs/>
-          <w:sz w:val="22"/>
-          <w:szCs w:val="24"/>
-          <w:u w:val="single"/>
-        </w:rPr>
-        <w:t>数据收集、建模和分析架构师</w:t>
-      </w:r>
-    </w:p>
-    <w:p>
-      <w:pPr>
-        <w:pStyle w:val="9"/>
-        <w:numPr>
-          <w:ilvl w:val="0"/>
-          <w:numId w:val="6"/>
-        </w:numPr>
-        <w:jc w:val="left"/>
-        <w:rPr>
-          <w:rFonts w:asciiTheme="majorEastAsia" w:hAnsiTheme="majorEastAsia" w:eastAsiaTheme="majorEastAsia"/>
-          <w:bCs/>
-          <w:sz w:val="22"/>
-          <w:szCs w:val="24"/>
-          <w:u w:val="single"/>
-        </w:rPr>
-      </w:pPr>
-      <w:r>
-        <w:rPr>
-          <w:rFonts w:hint="eastAsia" w:asciiTheme="majorEastAsia" w:hAnsiTheme="majorEastAsia" w:eastAsiaTheme="majorEastAsia"/>
-          <w:bCs/>
-          <w:sz w:val="22"/>
-          <w:szCs w:val="24"/>
-          <w:u w:val="single"/>
-        </w:rPr>
-        <w:t>工业物联网预测性维护解决方案(</w:t>
-      </w:r>
-      <w:r>
-        <w:rPr>
-          <w:rFonts w:asciiTheme="majorEastAsia" w:hAnsiTheme="majorEastAsia" w:eastAsiaTheme="majorEastAsia"/>
-          <w:bCs/>
-          <w:sz w:val="22"/>
-          <w:szCs w:val="24"/>
-          <w:u w:val="single"/>
-        </w:rPr>
-        <w:t>Python, Vue.js, SQL</w:t>
-      </w:r>
-      <w:r>
-        <w:rPr>
-          <w:rFonts w:hint="eastAsia" w:asciiTheme="majorEastAsia" w:hAnsiTheme="majorEastAsia" w:eastAsiaTheme="majorEastAsia"/>
-          <w:bCs/>
-          <w:sz w:val="22"/>
-          <w:szCs w:val="24"/>
-          <w:u w:val="single"/>
-        </w:rPr>
-        <w:t>,</w:t>
-      </w:r>
-      <w:r>
-        <w:rPr>
-          <w:rFonts w:asciiTheme="majorEastAsia" w:hAnsiTheme="majorEastAsia" w:eastAsiaTheme="majorEastAsia"/>
-          <w:bCs/>
-          <w:sz w:val="22"/>
-          <w:szCs w:val="24"/>
-          <w:u w:val="single"/>
-        </w:rPr>
-        <w:t xml:space="preserve"> Jupyter</w:t>
-      </w:r>
-      <w:r>
-        <w:rPr>
-          <w:rFonts w:hint="eastAsia" w:asciiTheme="majorEastAsia" w:hAnsiTheme="majorEastAsia" w:eastAsiaTheme="majorEastAsia"/>
-          <w:bCs/>
-          <w:sz w:val="22"/>
-          <w:szCs w:val="24"/>
-          <w:u w:val="single"/>
-        </w:rPr>
-        <w:t>,</w:t>
-      </w:r>
-      <w:r>
-        <w:rPr>
-          <w:rFonts w:asciiTheme="majorEastAsia" w:hAnsiTheme="majorEastAsia" w:eastAsiaTheme="majorEastAsia"/>
-          <w:bCs/>
-          <w:sz w:val="22"/>
-          <w:szCs w:val="24"/>
-          <w:u w:val="single"/>
-        </w:rPr>
-        <w:t xml:space="preserve"> Nginx</w:t>
-      </w:r>
-      <w:r>
-        <w:rPr>
-          <w:rFonts w:hint="eastAsia" w:asciiTheme="majorEastAsia" w:hAnsiTheme="majorEastAsia" w:eastAsiaTheme="majorEastAsia"/>
-          <w:bCs/>
-          <w:sz w:val="22"/>
-          <w:szCs w:val="24"/>
-          <w:u w:val="single"/>
-        </w:rPr>
-        <w:t>, AI</w:t>
-      </w:r>
-      <w:r>
-        <w:rPr>
-          <w:rFonts w:asciiTheme="majorEastAsia" w:hAnsiTheme="majorEastAsia" w:eastAsiaTheme="majorEastAsia"/>
-          <w:bCs/>
-          <w:sz w:val="22"/>
-          <w:szCs w:val="24"/>
-          <w:u w:val="single"/>
-        </w:rPr>
-        <w:t>)</w:t>
-      </w:r>
-    </w:p>
-    <w:p>
-      <w:pPr>
-        <w:pStyle w:val="9"/>
-        <w:ind w:left="786"/>
-        <w:jc w:val="left"/>
-        <w:rPr>
-          <w:rFonts w:asciiTheme="majorEastAsia" w:hAnsiTheme="majorEastAsia" w:eastAsiaTheme="majorEastAsia"/>
-          <w:bCs/>
-          <w:sz w:val="22"/>
-          <w:szCs w:val="24"/>
-        </w:rPr>
-      </w:pPr>
-      <w:bookmarkStart w:id="1" w:name="OLE_LINK5"/>
-      <w:r>
-        <w:rPr>
-          <w:rFonts w:hint="eastAsia" w:asciiTheme="majorEastAsia" w:hAnsiTheme="majorEastAsia" w:eastAsiaTheme="majorEastAsia"/>
-          <w:bCs/>
-          <w:sz w:val="22"/>
-          <w:szCs w:val="24"/>
-        </w:rPr>
-        <w:t>负责架构设计和核心编码实现。</w:t>
-      </w:r>
-      <w:bookmarkEnd w:id="1"/>
-      <w:r>
-        <w:rPr>
-          <w:rFonts w:hint="eastAsia" w:asciiTheme="majorEastAsia" w:hAnsiTheme="majorEastAsia" w:eastAsiaTheme="majorEastAsia"/>
-          <w:bCs/>
-          <w:sz w:val="22"/>
-          <w:szCs w:val="24"/>
-        </w:rPr>
-        <w:t>通过传感器（温湿度，振动，声音等信号）收集大数据，算法建模进行特征提取，给出预维护监控方案。包含IoT大数据建模与分析，算法处理，特征提取等，应用在工业物联网预维护场景。本解决方案已应用在汽车制造业，医疗行业，钻井行业等制造业。结合LLM，开发了智能数据助手、知识库等应用。</w:t>
-      </w:r>
-    </w:p>
-    <w:p>
-      <w:pPr>
-        <w:pStyle w:val="9"/>
-        <w:numPr>
-          <w:ilvl w:val="0"/>
-          <w:numId w:val="6"/>
-        </w:numPr>
-        <w:jc w:val="left"/>
-        <w:rPr>
-          <w:rFonts w:asciiTheme="majorEastAsia" w:hAnsiTheme="majorEastAsia" w:eastAsiaTheme="majorEastAsia"/>
-          <w:bCs/>
-          <w:sz w:val="22"/>
-          <w:szCs w:val="24"/>
-          <w:u w:val="single"/>
-        </w:rPr>
-      </w:pPr>
-      <w:bookmarkStart w:id="2" w:name="OLE_LINK4"/>
-      <w:r>
-        <w:rPr>
-          <w:rFonts w:hint="eastAsia" w:asciiTheme="majorEastAsia" w:hAnsiTheme="majorEastAsia" w:eastAsiaTheme="majorEastAsia"/>
-          <w:bCs/>
-          <w:sz w:val="22"/>
-          <w:szCs w:val="24"/>
-          <w:u w:val="single"/>
-        </w:rPr>
-        <w:t>城市物联网气象大数据和视频监控项目(</w:t>
-      </w:r>
-      <w:r>
-        <w:rPr>
-          <w:rFonts w:asciiTheme="majorEastAsia" w:hAnsiTheme="majorEastAsia" w:eastAsiaTheme="majorEastAsia"/>
-          <w:bCs/>
-          <w:sz w:val="22"/>
-          <w:szCs w:val="24"/>
-          <w:u w:val="single"/>
-        </w:rPr>
-        <w:t>Python, SQL, RabbitMQ, Kafka)</w:t>
-      </w:r>
-    </w:p>
-    <w:p>
-      <w:pPr>
-        <w:pStyle w:val="9"/>
-        <w:ind w:left="786"/>
-        <w:jc w:val="left"/>
-        <w:rPr>
-          <w:rFonts w:asciiTheme="majorEastAsia" w:hAnsiTheme="majorEastAsia" w:eastAsiaTheme="majorEastAsia"/>
-          <w:bCs/>
-          <w:sz w:val="22"/>
-          <w:szCs w:val="24"/>
-        </w:rPr>
-      </w:pPr>
-      <w:r>
-        <w:rPr>
-          <w:rFonts w:hint="eastAsia" w:asciiTheme="majorEastAsia" w:hAnsiTheme="majorEastAsia" w:eastAsiaTheme="majorEastAsia"/>
-          <w:bCs/>
-          <w:sz w:val="22"/>
-          <w:szCs w:val="24"/>
-        </w:rPr>
-        <w:t>负责架构设计和核心编码实现。通过覆盖无锡新吴区的传感器装置，收集大量数据并在云端处理后进行实时监控。摄像头应用在智慧停车。本项目为政府合作项目，已成功应用在无锡新吴区飞凤平台。</w:t>
-      </w:r>
-    </w:p>
-    <w:bookmarkEnd w:id="2"/>
-    <w:p>
-      <w:pPr>
-        <w:ind w:left="366" w:firstLine="420"/>
-        <w:jc w:val="left"/>
-        <w:rPr>
-          <w:rFonts w:asciiTheme="majorEastAsia" w:hAnsiTheme="majorEastAsia" w:eastAsiaTheme="majorEastAsia"/>
-          <w:bCs/>
-          <w:sz w:val="22"/>
-          <w:szCs w:val="24"/>
-          <w:u w:val="single"/>
-        </w:rPr>
-      </w:pPr>
-      <w:r>
-        <w:rPr>
-          <w:rFonts w:hint="eastAsia" w:asciiTheme="majorEastAsia" w:hAnsiTheme="majorEastAsia" w:eastAsiaTheme="majorEastAsia"/>
-          <w:bCs/>
-          <w:sz w:val="22"/>
-          <w:szCs w:val="24"/>
-        </w:rPr>
-        <w:t>3</w:t>
-      </w:r>
-      <w:r>
-        <w:rPr>
-          <w:rFonts w:asciiTheme="majorEastAsia" w:hAnsiTheme="majorEastAsia" w:eastAsiaTheme="majorEastAsia"/>
-          <w:bCs/>
-          <w:sz w:val="22"/>
-          <w:szCs w:val="24"/>
-        </w:rPr>
-        <w:t xml:space="preserve">. </w:t>
-      </w:r>
-      <w:r>
-        <w:rPr>
-          <w:rFonts w:hint="eastAsia" w:asciiTheme="majorEastAsia" w:hAnsiTheme="majorEastAsia" w:eastAsiaTheme="majorEastAsia"/>
-          <w:bCs/>
-          <w:sz w:val="22"/>
-          <w:szCs w:val="24"/>
-          <w:u w:val="single"/>
-        </w:rPr>
-        <w:t>城市物联网桥梁大数据监控项目(</w:t>
-      </w:r>
-      <w:r>
-        <w:rPr>
-          <w:rFonts w:asciiTheme="majorEastAsia" w:hAnsiTheme="majorEastAsia" w:eastAsiaTheme="majorEastAsia"/>
-          <w:bCs/>
-          <w:sz w:val="22"/>
-          <w:szCs w:val="24"/>
-          <w:u w:val="single"/>
-        </w:rPr>
-        <w:t>Python, SQL, Jupyter, Nginx)</w:t>
-      </w:r>
-    </w:p>
-    <w:p>
-      <w:pPr>
-        <w:pStyle w:val="9"/>
-        <w:ind w:left="786"/>
-        <w:jc w:val="left"/>
-        <w:rPr>
-          <w:rFonts w:asciiTheme="majorEastAsia" w:hAnsiTheme="majorEastAsia" w:eastAsiaTheme="majorEastAsia"/>
-          <w:bCs/>
-          <w:sz w:val="22"/>
-          <w:szCs w:val="24"/>
-        </w:rPr>
-      </w:pPr>
-      <w:r>
-        <w:rPr>
-          <w:rFonts w:hint="eastAsia" w:asciiTheme="majorEastAsia" w:hAnsiTheme="majorEastAsia" w:eastAsiaTheme="majorEastAsia"/>
-          <w:bCs/>
-          <w:sz w:val="22"/>
-          <w:szCs w:val="24"/>
-        </w:rPr>
-        <w:t>负责项目架构设计、开发及部署。通过安装在桥梁的振动传感器和摄像头组成的传感装置，收集大量桥梁振动数据，建模后提取车辆特征，实时监控桥梁上大卡车及超重车辆行驶情况。本项目已成功通过无锡市科创项目验收。</w:t>
-      </w:r>
-    </w:p>
-    <w:p>
-      <w:pPr>
-        <w:ind w:left="786"/>
-        <w:jc w:val="left"/>
-        <w:rPr>
-          <w:rFonts w:asciiTheme="majorEastAsia" w:hAnsiTheme="majorEastAsia" w:eastAsiaTheme="majorEastAsia"/>
-          <w:bCs/>
-          <w:sz w:val="22"/>
-          <w:szCs w:val="24"/>
-        </w:rPr>
-      </w:pPr>
-      <w:r>
-        <w:rPr>
-          <w:rFonts w:hint="eastAsia" w:asciiTheme="majorEastAsia" w:hAnsiTheme="majorEastAsia" w:eastAsiaTheme="majorEastAsia"/>
-          <w:bCs/>
-          <w:sz w:val="22"/>
-          <w:szCs w:val="24"/>
-        </w:rPr>
-        <w:t xml:space="preserve">4. </w:t>
-      </w:r>
-      <w:r>
-        <w:rPr>
-          <w:rFonts w:hint="eastAsia" w:asciiTheme="majorEastAsia" w:hAnsiTheme="majorEastAsia" w:eastAsiaTheme="majorEastAsia"/>
-          <w:bCs/>
-          <w:sz w:val="22"/>
-          <w:szCs w:val="24"/>
-          <w:u w:val="single"/>
-        </w:rPr>
-        <w:t>大语言模型LLM预研及应用开发</w:t>
-      </w:r>
-    </w:p>
-    <w:p>
-      <w:pPr>
-        <w:ind w:left="786"/>
-        <w:jc w:val="left"/>
-        <w:rPr>
-          <w:rFonts w:asciiTheme="majorEastAsia" w:hAnsiTheme="majorEastAsia" w:eastAsiaTheme="majorEastAsia"/>
-          <w:bCs/>
-          <w:sz w:val="22"/>
-          <w:szCs w:val="24"/>
-        </w:rPr>
-      </w:pPr>
-      <w:r>
-        <w:rPr>
-          <w:rFonts w:hint="eastAsia" w:asciiTheme="majorEastAsia" w:hAnsiTheme="majorEastAsia" w:eastAsiaTheme="majorEastAsia"/>
-          <w:bCs/>
-          <w:sz w:val="22"/>
-          <w:szCs w:val="24"/>
-        </w:rPr>
-        <w:t>负责架构设计和核心代码实现，结合西门子IoT云平台服务，预研大模型使用场景及编程实现，覆盖竞品SWOT分析、编程框架对比及路径实现等。配合业务部门成功举办Hackathon及客户案例应用，多次在组织内进行相关技术分享。同时应用在智能数据分析及知识库助手等。</w:t>
-      </w:r>
-    </w:p>
-    <w:p>
-      <w:pPr>
-        <w:ind w:left="786"/>
-        <w:jc w:val="left"/>
-        <w:rPr>
-          <w:rFonts w:asciiTheme="majorEastAsia" w:hAnsiTheme="majorEastAsia" w:eastAsiaTheme="majorEastAsia"/>
-          <w:bCs/>
-          <w:sz w:val="22"/>
-          <w:szCs w:val="24"/>
-        </w:rPr>
-      </w:pPr>
-      <w:r>
-        <w:rPr>
-          <w:rFonts w:hint="eastAsia" w:asciiTheme="majorEastAsia" w:hAnsiTheme="majorEastAsia" w:eastAsiaTheme="majorEastAsia"/>
-          <w:bCs/>
-          <w:sz w:val="22"/>
-          <w:szCs w:val="24"/>
-        </w:rPr>
-        <w:t xml:space="preserve">5. </w:t>
-      </w:r>
-      <w:r>
-        <w:rPr>
-          <w:rFonts w:hint="eastAsia" w:asciiTheme="majorEastAsia" w:hAnsiTheme="majorEastAsia" w:eastAsiaTheme="majorEastAsia"/>
-          <w:bCs/>
-          <w:sz w:val="22"/>
-          <w:szCs w:val="24"/>
-          <w:u w:val="single"/>
-        </w:rPr>
-        <w:t>汽车行业数据空间Catena-X国内首次成功部署</w:t>
-      </w:r>
-    </w:p>
-    <w:p>
-      <w:pPr>
-        <w:ind w:left="786"/>
-        <w:jc w:val="left"/>
-        <w:rPr>
-          <w:rFonts w:asciiTheme="majorEastAsia" w:hAnsiTheme="majorEastAsia" w:eastAsiaTheme="majorEastAsia"/>
-          <w:bCs/>
-          <w:sz w:val="22"/>
-          <w:szCs w:val="24"/>
-        </w:rPr>
-      </w:pPr>
-      <w:r>
-        <w:rPr>
-          <w:rFonts w:hint="eastAsia" w:asciiTheme="majorEastAsia" w:hAnsiTheme="majorEastAsia" w:eastAsiaTheme="majorEastAsia"/>
-          <w:bCs/>
-          <w:sz w:val="22"/>
-          <w:szCs w:val="24"/>
-        </w:rPr>
-        <w:t>Catena-X是德国主导的欧洲汽车行业数据空间交换标准。从21年伊始关注并参与中国区会议，研究技术框架和尝试部署。在24年底短时间内（3天）成功在宁德时代总部（CATL）部署和宝马德国（BMW）的数据空间交换PoC，覆盖数据交换、电池护照和数字孪生等信息，成为国内首次成功实施的解决方案。</w:t>
-      </w:r>
-    </w:p>
-    <w:p>
-      <w:pPr>
-        <w:jc w:val="left"/>
-        <w:rPr>
-          <w:rFonts w:asciiTheme="majorEastAsia" w:hAnsiTheme="majorEastAsia" w:eastAsiaTheme="majorEastAsia"/>
-          <w:bCs/>
-          <w:sz w:val="22"/>
-          <w:szCs w:val="24"/>
-        </w:rPr>
-      </w:pPr>
-      <w:r>
-        <w:rPr>
-          <w:rFonts w:hint="eastAsia" w:asciiTheme="majorEastAsia" w:hAnsiTheme="majorEastAsia" w:eastAsiaTheme="majorEastAsia"/>
-          <w:bCs/>
-          <w:sz w:val="22"/>
-          <w:szCs w:val="24"/>
-        </w:rPr>
-        <w:t xml:space="preserve">    2. </w:t>
-      </w:r>
-      <w:r>
-        <w:rPr>
-          <w:rFonts w:hint="eastAsia" w:asciiTheme="majorEastAsia" w:hAnsiTheme="majorEastAsia" w:eastAsiaTheme="majorEastAsia"/>
-          <w:bCs/>
-          <w:sz w:val="22"/>
-          <w:szCs w:val="24"/>
-          <w:u w:val="single"/>
-        </w:rPr>
-        <w:t>项目经理</w:t>
-      </w:r>
-    </w:p>
-    <w:p>
-      <w:pPr>
-        <w:jc w:val="left"/>
-        <w:rPr>
-          <w:rFonts w:asciiTheme="majorEastAsia" w:hAnsiTheme="majorEastAsia" w:eastAsiaTheme="majorEastAsia"/>
-          <w:bCs/>
-          <w:sz w:val="22"/>
-          <w:szCs w:val="24"/>
-        </w:rPr>
-      </w:pPr>
-      <w:r>
-        <w:rPr>
-          <w:rFonts w:asciiTheme="majorEastAsia" w:hAnsiTheme="majorEastAsia" w:eastAsiaTheme="majorEastAsia"/>
-          <w:bCs/>
-          <w:sz w:val="22"/>
-          <w:szCs w:val="24"/>
-        </w:rPr>
-        <w:tab/>
-      </w:r>
-      <w:r>
-        <w:rPr>
-          <w:rFonts w:asciiTheme="majorEastAsia" w:hAnsiTheme="majorEastAsia" w:eastAsiaTheme="majorEastAsia"/>
-          <w:bCs/>
-          <w:sz w:val="22"/>
-          <w:szCs w:val="24"/>
-        </w:rPr>
-        <w:tab/>
-      </w:r>
-      <w:r>
-        <w:rPr>
-          <w:rFonts w:hint="eastAsia" w:asciiTheme="majorEastAsia" w:hAnsiTheme="majorEastAsia" w:eastAsiaTheme="majorEastAsia"/>
-          <w:bCs/>
-          <w:sz w:val="22"/>
-          <w:szCs w:val="24"/>
-        </w:rPr>
-        <w:t xml:space="preserve">1. </w:t>
-      </w:r>
-      <w:r>
-        <w:rPr>
-          <w:rFonts w:hint="eastAsia" w:asciiTheme="majorEastAsia" w:hAnsiTheme="majorEastAsia" w:eastAsiaTheme="majorEastAsia"/>
-          <w:bCs/>
-          <w:sz w:val="22"/>
-          <w:szCs w:val="24"/>
-          <w:u w:val="single"/>
-        </w:rPr>
-        <w:t>新吴区科创项目交付</w:t>
-      </w:r>
-    </w:p>
-    <w:p>
-      <w:pPr>
-        <w:ind w:left="840"/>
-        <w:jc w:val="left"/>
-        <w:rPr>
-          <w:rFonts w:asciiTheme="majorEastAsia" w:hAnsiTheme="majorEastAsia" w:eastAsiaTheme="majorEastAsia"/>
-          <w:bCs/>
-          <w:sz w:val="22"/>
-          <w:szCs w:val="24"/>
-        </w:rPr>
-      </w:pPr>
-      <w:r>
-        <w:rPr>
-          <w:rFonts w:hint="eastAsia" w:asciiTheme="majorEastAsia" w:hAnsiTheme="majorEastAsia" w:eastAsiaTheme="majorEastAsia"/>
-          <w:bCs/>
-          <w:sz w:val="22"/>
-          <w:szCs w:val="24"/>
-        </w:rPr>
-        <w:t>负责年度新吴区科创项目的选型、交付、成果验收及基金申请等项目，成功通过验收。同时沟通协调参加无锡年度物联网博览会。</w:t>
-      </w:r>
-    </w:p>
-    <w:p>
-      <w:pPr>
-        <w:jc w:val="left"/>
-        <w:rPr>
-          <w:rFonts w:asciiTheme="majorEastAsia" w:hAnsiTheme="majorEastAsia" w:eastAsiaTheme="majorEastAsia"/>
-          <w:bCs/>
-          <w:sz w:val="22"/>
-          <w:szCs w:val="24"/>
-        </w:rPr>
-      </w:pPr>
-      <w:r>
-        <w:rPr>
-          <w:rFonts w:asciiTheme="majorEastAsia" w:hAnsiTheme="majorEastAsia" w:eastAsiaTheme="majorEastAsia"/>
-          <w:bCs/>
-          <w:sz w:val="22"/>
-          <w:szCs w:val="24"/>
-        </w:rPr>
-        <w:tab/>
-      </w:r>
-      <w:r>
-        <w:rPr>
-          <w:rFonts w:asciiTheme="majorEastAsia" w:hAnsiTheme="majorEastAsia" w:eastAsiaTheme="majorEastAsia"/>
-          <w:bCs/>
-          <w:sz w:val="22"/>
-          <w:szCs w:val="24"/>
-        </w:rPr>
-        <w:tab/>
-      </w:r>
-      <w:r>
-        <w:rPr>
-          <w:rFonts w:hint="eastAsia" w:asciiTheme="majorEastAsia" w:hAnsiTheme="majorEastAsia" w:eastAsiaTheme="majorEastAsia"/>
-          <w:bCs/>
-          <w:sz w:val="22"/>
-          <w:szCs w:val="24"/>
-        </w:rPr>
-        <w:t xml:space="preserve">2. </w:t>
-      </w:r>
-      <w:r>
-        <w:rPr>
-          <w:rFonts w:hint="eastAsia" w:asciiTheme="majorEastAsia" w:hAnsiTheme="majorEastAsia" w:eastAsiaTheme="majorEastAsia"/>
-          <w:bCs/>
-          <w:sz w:val="22"/>
-          <w:szCs w:val="24"/>
-          <w:u w:val="single"/>
-        </w:rPr>
-        <w:t>Decoupling跨部门沟通</w:t>
-      </w:r>
-    </w:p>
-    <w:p>
-      <w:pPr>
-        <w:ind w:left="840"/>
-        <w:jc w:val="left"/>
-        <w:rPr>
-          <w:rFonts w:asciiTheme="majorEastAsia" w:hAnsiTheme="majorEastAsia" w:eastAsiaTheme="majorEastAsia"/>
-          <w:bCs/>
-          <w:sz w:val="22"/>
-          <w:szCs w:val="24"/>
-        </w:rPr>
-      </w:pPr>
-      <w:r>
-        <w:rPr>
-          <w:rFonts w:hint="eastAsia" w:asciiTheme="majorEastAsia" w:hAnsiTheme="majorEastAsia" w:eastAsiaTheme="majorEastAsia"/>
-          <w:bCs/>
-          <w:sz w:val="22"/>
-          <w:szCs w:val="24"/>
-        </w:rPr>
-        <w:t>主导“Decoupling”项目，聚焦于评估组织内部各项技术与中美技术脱钩背景的关联性。负责跨部门沟通协调，与技术专家及部门负责人共同识别技术共性及潜在风险点，分析其与脱钩趋势的相关性。项目涵盖多领域技术，要求较强的技术综合理解能力与高效沟通能力。最终交付成果为全面技术风险评估报告及针对性改进建议，为组织技术战略决策提供关键依据。</w:t>
-      </w:r>
-    </w:p>
-    <w:p>
-      <w:pPr>
-        <w:jc w:val="left"/>
-        <w:rPr>
-          <w:rFonts w:asciiTheme="majorEastAsia" w:hAnsiTheme="majorEastAsia" w:eastAsiaTheme="majorEastAsia"/>
-          <w:bCs/>
-          <w:sz w:val="22"/>
-          <w:szCs w:val="24"/>
-        </w:rPr>
-      </w:pPr>
-      <w:r>
-        <w:rPr>
-          <w:rFonts w:asciiTheme="majorEastAsia" w:hAnsiTheme="majorEastAsia" w:eastAsiaTheme="majorEastAsia"/>
-          <w:bCs/>
-          <w:sz w:val="22"/>
-          <w:szCs w:val="24"/>
-        </w:rPr>
-        <w:tab/>
-      </w:r>
-      <w:r>
-        <w:rPr>
-          <w:rFonts w:asciiTheme="majorEastAsia" w:hAnsiTheme="majorEastAsia" w:eastAsiaTheme="majorEastAsia"/>
-          <w:bCs/>
-          <w:sz w:val="22"/>
-          <w:szCs w:val="24"/>
-        </w:rPr>
-        <w:tab/>
-      </w:r>
-      <w:r>
-        <w:rPr>
-          <w:rFonts w:hint="eastAsia" w:asciiTheme="majorEastAsia" w:hAnsiTheme="majorEastAsia" w:eastAsiaTheme="majorEastAsia"/>
-          <w:bCs/>
-          <w:sz w:val="22"/>
-          <w:szCs w:val="24"/>
-        </w:rPr>
-        <w:t xml:space="preserve">3. </w:t>
-      </w:r>
-      <w:r>
-        <w:rPr>
-          <w:rFonts w:hint="eastAsia" w:asciiTheme="majorEastAsia" w:hAnsiTheme="majorEastAsia" w:eastAsiaTheme="majorEastAsia"/>
-          <w:bCs/>
-          <w:sz w:val="22"/>
-          <w:szCs w:val="24"/>
-          <w:u w:val="single"/>
-        </w:rPr>
-        <w:t>AirLink移植可行性项目交付</w:t>
-      </w:r>
-    </w:p>
-    <w:p>
-      <w:pPr>
-        <w:ind w:left="420"/>
-        <w:jc w:val="left"/>
-        <w:rPr>
-          <w:rFonts w:asciiTheme="majorEastAsia" w:hAnsiTheme="majorEastAsia" w:eastAsiaTheme="majorEastAsia"/>
-          <w:bCs/>
-          <w:sz w:val="22"/>
-          <w:szCs w:val="24"/>
-        </w:rPr>
-      </w:pPr>
-      <w:r>
-        <w:rPr>
-          <w:rFonts w:hint="eastAsia" w:asciiTheme="majorEastAsia" w:hAnsiTheme="majorEastAsia" w:eastAsiaTheme="majorEastAsia"/>
-          <w:bCs/>
-          <w:sz w:val="22"/>
-          <w:szCs w:val="24"/>
-        </w:rPr>
-        <w:t xml:space="preserve">    负责带领团队（6人）完成西门子AirLink从windows平台移植到Linux，尤其是利用Docker等容器化技术的可行性研究及尝试。最终成功交付经过验证的Demo及可行性报告，并利用Docker容器的网络和Privilege模式提出了进一步优化方案。</w:t>
-      </w:r>
-    </w:p>
-    <w:p>
-      <w:pPr>
-        <w:ind w:firstLine="420"/>
-        <w:jc w:val="left"/>
-        <w:rPr>
-          <w:rFonts w:asciiTheme="majorEastAsia" w:hAnsiTheme="majorEastAsia" w:eastAsiaTheme="majorEastAsia"/>
-          <w:bCs/>
-          <w:sz w:val="22"/>
-          <w:szCs w:val="24"/>
-        </w:rPr>
-      </w:pPr>
-      <w:r>
-        <w:rPr>
-          <w:rFonts w:hint="eastAsia" w:asciiTheme="majorEastAsia" w:hAnsiTheme="majorEastAsia" w:eastAsiaTheme="majorEastAsia"/>
-          <w:bCs/>
-          <w:sz w:val="22"/>
-          <w:szCs w:val="24"/>
-        </w:rPr>
-        <w:t xml:space="preserve">3. </w:t>
-      </w:r>
-      <w:r>
-        <w:rPr>
-          <w:rFonts w:hint="eastAsia" w:asciiTheme="majorEastAsia" w:hAnsiTheme="majorEastAsia" w:eastAsiaTheme="majorEastAsia"/>
-          <w:bCs/>
-          <w:sz w:val="22"/>
-          <w:szCs w:val="24"/>
-          <w:u w:val="single"/>
-        </w:rPr>
-        <w:t>沟通窗口</w:t>
-      </w:r>
-    </w:p>
-    <w:p>
-      <w:pPr>
-        <w:ind w:left="840"/>
-        <w:jc w:val="left"/>
-        <w:rPr>
-          <w:rFonts w:asciiTheme="majorEastAsia" w:hAnsiTheme="majorEastAsia" w:eastAsiaTheme="majorEastAsia"/>
-          <w:bCs/>
-          <w:sz w:val="22"/>
-          <w:szCs w:val="24"/>
-        </w:rPr>
-      </w:pPr>
-      <w:r>
-        <w:rPr>
-          <w:rFonts w:hint="eastAsia" w:asciiTheme="majorEastAsia" w:hAnsiTheme="majorEastAsia" w:eastAsiaTheme="majorEastAsia"/>
-          <w:bCs/>
-          <w:sz w:val="22"/>
-          <w:szCs w:val="24"/>
-        </w:rPr>
-        <w:t>1.负责与德国及其他欧洲同事、印度同事等对接，完成相关项目。其中独立负责某西门子中国工厂关键之间设备的软硬件升级的对接工作。</w:t>
-      </w:r>
-    </w:p>
-    <w:p>
-      <w:pPr>
-        <w:ind w:left="840"/>
-        <w:jc w:val="left"/>
-        <w:rPr>
-          <w:rFonts w:asciiTheme="majorEastAsia" w:hAnsiTheme="majorEastAsia" w:eastAsiaTheme="majorEastAsia"/>
-          <w:bCs/>
-          <w:sz w:val="22"/>
-          <w:szCs w:val="24"/>
-        </w:rPr>
-      </w:pPr>
-      <w:r>
-        <w:rPr>
-          <w:rFonts w:hint="eastAsia" w:asciiTheme="majorEastAsia" w:hAnsiTheme="majorEastAsia" w:eastAsiaTheme="majorEastAsia"/>
-          <w:bCs/>
-          <w:sz w:val="22"/>
-          <w:szCs w:val="24"/>
-        </w:rPr>
-        <w:t>2.负责筹备和组建“Open Source@西门子”年度活动（今年将举办第三届）。负责宣传、推广西门子在工业开源领域的进展和活动，同时邀请其他领域（Xenomai实时控制、人工智能、开源半导体，RISC-V等）嘉宾共同参与。作为演讲人介绍西门子LLM API方案，链接：</w:t>
-      </w:r>
-      <w:r>
-        <w:fldChar w:fldCharType="begin"/>
-      </w:r>
-      <w:r>
-        <w:instrText xml:space="preserve">HYPERLINK "https://opensource.siemens.com/events/2024cn/"</w:instrText>
-      </w:r>
-      <w:r>
-        <w:fldChar w:fldCharType="separate"/>
-      </w:r>
-      <w:r>
-        <w:rPr>
-          <w:rStyle w:val="6"/>
-          <w:rFonts w:asciiTheme="majorEastAsia" w:hAnsiTheme="majorEastAsia" w:eastAsiaTheme="majorEastAsia"/>
-          <w:bCs/>
-          <w:sz w:val="22"/>
-          <w:szCs w:val="24"/>
-        </w:rPr>
-        <w:t>opensource.siemens.com</w:t>
-      </w:r>
-      <w:r>
-        <w:fldChar w:fldCharType="end"/>
-      </w:r>
-      <w:r>
-        <w:rPr>
-          <w:rFonts w:hint="eastAsia" w:asciiTheme="majorEastAsia" w:hAnsiTheme="majorEastAsia" w:eastAsiaTheme="majorEastAsia"/>
-          <w:bCs/>
-          <w:sz w:val="22"/>
-          <w:szCs w:val="24"/>
-        </w:rPr>
-        <w:t>。</w:t>
-      </w:r>
-    </w:p>
-    <w:p>
-      <w:pPr>
-        <w:jc w:val="left"/>
-        <w:rPr>
-          <w:rFonts w:asciiTheme="majorEastAsia" w:hAnsiTheme="majorEastAsia" w:eastAsiaTheme="majorEastAsia"/>
-          <w:bCs/>
-          <w:sz w:val="22"/>
-          <w:szCs w:val="24"/>
-        </w:rPr>
-      </w:pPr>
-    </w:p>
-    <w:p>
-      <w:pPr>
-        <w:pStyle w:val="9"/>
-        <w:numPr>
-          <w:ilvl w:val="0"/>
-          <w:numId w:val="3"/>
-        </w:numPr>
-        <w:jc w:val="left"/>
-        <w:rPr>
-          <w:rFonts w:eastAsiaTheme="majorEastAsia"/>
-          <w:b/>
-          <w:sz w:val="22"/>
-          <w:szCs w:val="24"/>
-        </w:rPr>
-      </w:pPr>
-      <w:bookmarkStart w:id="3" w:name="OLE_LINK2"/>
-      <w:r>
-        <w:rPr>
-          <w:rFonts w:eastAsiaTheme="majorEastAsia"/>
-          <w:b/>
-          <w:sz w:val="22"/>
-          <w:szCs w:val="24"/>
-        </w:rPr>
-        <w:t>20</w:t>
-      </w:r>
-      <w:r>
-        <w:rPr>
-          <w:rFonts w:hint="eastAsia" w:eastAsiaTheme="majorEastAsia"/>
-          <w:b/>
-          <w:sz w:val="22"/>
-          <w:szCs w:val="24"/>
-        </w:rPr>
-        <w:t>20</w:t>
-      </w:r>
-      <w:r>
-        <w:rPr>
-          <w:rFonts w:eastAsiaTheme="majorEastAsia"/>
-          <w:b/>
-          <w:sz w:val="22"/>
-          <w:szCs w:val="24"/>
-        </w:rPr>
-        <w:t>.0</w:t>
-      </w:r>
-      <w:r>
-        <w:rPr>
-          <w:rFonts w:hint="eastAsia" w:eastAsiaTheme="majorEastAsia"/>
-          <w:b/>
-          <w:sz w:val="22"/>
-          <w:szCs w:val="24"/>
-        </w:rPr>
-        <w:t>6</w:t>
-      </w:r>
-      <w:r>
-        <w:rPr>
-          <w:rFonts w:eastAsiaTheme="majorEastAsia"/>
-          <w:b/>
-          <w:sz w:val="22"/>
-          <w:szCs w:val="24"/>
-        </w:rPr>
-        <w:t xml:space="preserve"> – 2021.6</w:t>
-      </w:r>
-      <w:r>
-        <w:rPr>
-          <w:rFonts w:eastAsiaTheme="majorEastAsia"/>
-          <w:b/>
-          <w:sz w:val="22"/>
-          <w:szCs w:val="24"/>
-        </w:rPr>
-        <w:tab/>
-      </w:r>
-      <w:r>
-        <w:rPr>
-          <w:rFonts w:hint="eastAsia" w:eastAsiaTheme="majorEastAsia"/>
-          <w:b/>
-          <w:sz w:val="22"/>
-          <w:szCs w:val="24"/>
-        </w:rPr>
-        <w:t>博世中国创新与软件开发中心</w:t>
-      </w:r>
-      <w:r>
-        <w:rPr>
-          <w:rFonts w:eastAsiaTheme="majorEastAsia"/>
-          <w:b/>
-          <w:sz w:val="22"/>
-          <w:szCs w:val="24"/>
-        </w:rPr>
-        <w:tab/>
-      </w:r>
-      <w:r>
-        <w:rPr>
-          <w:rFonts w:hint="eastAsia" w:eastAsiaTheme="majorEastAsia"/>
-          <w:b/>
-          <w:sz w:val="22"/>
-          <w:szCs w:val="24"/>
-        </w:rPr>
-        <w:t>Competence Leader</w:t>
-      </w:r>
-    </w:p>
-    <w:bookmarkEnd w:id="3"/>
-    <w:p>
-      <w:pPr>
-        <w:pStyle w:val="9"/>
-        <w:numPr>
-          <w:ilvl w:val="0"/>
-          <w:numId w:val="7"/>
-        </w:numPr>
-        <w:jc w:val="left"/>
-        <w:rPr>
-          <w:rFonts w:eastAsiaTheme="majorEastAsia"/>
-          <w:sz w:val="22"/>
-          <w:szCs w:val="24"/>
-          <w:u w:val="single"/>
-        </w:rPr>
-      </w:pPr>
-      <w:bookmarkStart w:id="4" w:name="OLE_LINK3"/>
-      <w:r>
-        <w:rPr>
-          <w:rFonts w:hint="eastAsia" w:eastAsiaTheme="majorEastAsia"/>
-          <w:sz w:val="22"/>
-          <w:szCs w:val="24"/>
-          <w:u w:val="single"/>
-        </w:rPr>
-        <w:t>联合汽车电子工具测试开发及车联网大数据项目经理(Jira</w:t>
-      </w:r>
-      <w:r>
-        <w:rPr>
-          <w:rFonts w:eastAsiaTheme="majorEastAsia"/>
-          <w:sz w:val="22"/>
-          <w:szCs w:val="24"/>
-          <w:u w:val="single"/>
-        </w:rPr>
-        <w:t>, Java, Python</w:t>
-      </w:r>
-      <w:r>
-        <w:rPr>
-          <w:rFonts w:hint="eastAsia" w:eastAsiaTheme="majorEastAsia"/>
-          <w:sz w:val="22"/>
-          <w:szCs w:val="24"/>
-          <w:u w:val="single"/>
-        </w:rPr>
-        <w:t>,</w:t>
-      </w:r>
-      <w:r>
-        <w:rPr>
-          <w:rFonts w:eastAsiaTheme="majorEastAsia"/>
-          <w:sz w:val="22"/>
-          <w:szCs w:val="24"/>
-          <w:u w:val="single"/>
-        </w:rPr>
-        <w:t xml:space="preserve"> Kafka, RabbitMQ, Vue.js</w:t>
-      </w:r>
-      <w:r>
-        <w:rPr>
-          <w:rFonts w:hint="eastAsia" w:eastAsiaTheme="majorEastAsia"/>
-          <w:sz w:val="22"/>
-          <w:szCs w:val="24"/>
-          <w:u w:val="single"/>
-        </w:rPr>
-        <w:t>)</w:t>
-      </w:r>
-    </w:p>
-    <w:p>
-      <w:pPr>
-        <w:pStyle w:val="9"/>
-        <w:ind w:left="780"/>
-        <w:jc w:val="left"/>
-        <w:rPr>
-          <w:rFonts w:eastAsiaTheme="majorEastAsia"/>
-          <w:sz w:val="22"/>
-          <w:szCs w:val="24"/>
-        </w:rPr>
-      </w:pPr>
-      <w:r>
-        <w:rPr>
-          <w:rFonts w:hint="eastAsia" w:eastAsiaTheme="majorEastAsia"/>
-          <w:kern w:val="0"/>
-          <w:sz w:val="22"/>
-          <w:szCs w:val="24"/>
-        </w:rPr>
-        <w:t>负责对接车联网大数据开发团队，搭建数据收集、分析、展示服务；</w:t>
-      </w:r>
-      <w:r>
-        <w:rPr>
-          <w:rFonts w:hint="eastAsia" w:eastAsiaTheme="majorEastAsia"/>
-          <w:sz w:val="22"/>
-          <w:szCs w:val="24"/>
-        </w:rPr>
-        <w:t>负责对接联合汽车电子各事业部工具和测试开发需求，负责项目交付。</w:t>
-      </w:r>
-    </w:p>
-    <w:bookmarkEnd w:id="4"/>
-    <w:p>
-      <w:pPr>
-        <w:pStyle w:val="9"/>
-        <w:numPr>
-          <w:ilvl w:val="0"/>
-          <w:numId w:val="7"/>
-        </w:numPr>
-        <w:jc w:val="left"/>
-        <w:rPr>
-          <w:rFonts w:eastAsiaTheme="majorEastAsia"/>
-          <w:sz w:val="22"/>
-          <w:szCs w:val="24"/>
-          <w:u w:val="single"/>
-        </w:rPr>
-      </w:pPr>
-      <w:r>
-        <w:rPr>
-          <w:rFonts w:hint="eastAsia" w:eastAsiaTheme="majorEastAsia"/>
-          <w:sz w:val="22"/>
-          <w:szCs w:val="24"/>
-          <w:u w:val="single"/>
-        </w:rPr>
-        <w:t>无锡博世车联网大数据项目接口人，开发成员(</w:t>
-      </w:r>
-      <w:r>
-        <w:rPr>
-          <w:rFonts w:eastAsiaTheme="majorEastAsia"/>
-          <w:sz w:val="22"/>
-          <w:szCs w:val="24"/>
-          <w:u w:val="single"/>
-        </w:rPr>
-        <w:t>Python, Vue.js, MQTT, Java, OSGi)</w:t>
-      </w:r>
-    </w:p>
-    <w:p>
-      <w:pPr>
-        <w:pStyle w:val="9"/>
-        <w:ind w:left="780"/>
-        <w:jc w:val="left"/>
-        <w:rPr>
-          <w:rFonts w:eastAsiaTheme="majorEastAsia"/>
-          <w:sz w:val="22"/>
-          <w:szCs w:val="24"/>
-        </w:rPr>
-      </w:pPr>
-      <w:r>
-        <w:rPr>
-          <w:rFonts w:hint="eastAsia" w:eastAsiaTheme="majorEastAsia"/>
-          <w:sz w:val="22"/>
-          <w:szCs w:val="24"/>
-        </w:rPr>
-        <w:t>作为项目接口人，负责车联网大数据云端开发需求，包括架构设计和代码编写，搭建了MQTT协议架构和PKI管理系统；参与设备端中间件软件设计和代码编写，基于OSGi框架。</w:t>
-      </w:r>
-    </w:p>
-    <w:p>
-      <w:pPr>
-        <w:pStyle w:val="9"/>
-        <w:ind w:left="780"/>
-        <w:jc w:val="left"/>
-        <w:rPr>
-          <w:rFonts w:eastAsiaTheme="majorEastAsia"/>
-          <w:sz w:val="22"/>
-          <w:szCs w:val="24"/>
-        </w:rPr>
-      </w:pPr>
-    </w:p>
-    <w:p>
-      <w:pPr>
-        <w:pStyle w:val="9"/>
-        <w:numPr>
-          <w:ilvl w:val="0"/>
-          <w:numId w:val="3"/>
-        </w:numPr>
-        <w:jc w:val="left"/>
-        <w:rPr>
-          <w:rFonts w:eastAsiaTheme="majorEastAsia"/>
-          <w:b/>
-          <w:sz w:val="22"/>
-          <w:szCs w:val="24"/>
-        </w:rPr>
-      </w:pPr>
-      <w:r>
-        <w:rPr>
-          <w:rFonts w:eastAsiaTheme="majorEastAsia"/>
-          <w:b/>
-          <w:sz w:val="22"/>
-          <w:szCs w:val="24"/>
-        </w:rPr>
-        <w:t xml:space="preserve">2018.05 – </w:t>
-      </w:r>
-      <w:r>
-        <w:rPr>
-          <w:rFonts w:hint="eastAsia" w:eastAsiaTheme="majorEastAsia"/>
-          <w:b/>
-          <w:sz w:val="22"/>
-          <w:szCs w:val="24"/>
-        </w:rPr>
-        <w:t>2020.</w:t>
-      </w:r>
-      <w:r>
-        <w:rPr>
-          <w:rFonts w:eastAsiaTheme="majorEastAsia"/>
-          <w:b/>
-          <w:sz w:val="22"/>
-          <w:szCs w:val="24"/>
-        </w:rPr>
-        <w:t>5</w:t>
-      </w:r>
-      <w:r>
-        <w:rPr>
-          <w:rFonts w:eastAsiaTheme="majorEastAsia"/>
-          <w:b/>
-          <w:sz w:val="22"/>
-          <w:szCs w:val="24"/>
-        </w:rPr>
-        <w:tab/>
-      </w:r>
-      <w:r>
-        <w:rPr>
-          <w:rFonts w:eastAsiaTheme="majorEastAsia"/>
-          <w:b/>
-          <w:sz w:val="22"/>
-          <w:szCs w:val="24"/>
-        </w:rPr>
-        <w:t>博世力士乐（常州）有限公司</w:t>
-      </w:r>
-      <w:r>
-        <w:rPr>
-          <w:rFonts w:eastAsiaTheme="majorEastAsia"/>
-          <w:b/>
-          <w:sz w:val="22"/>
-          <w:szCs w:val="24"/>
-        </w:rPr>
-        <w:tab/>
-      </w:r>
-      <w:r>
-        <w:rPr>
-          <w:rFonts w:eastAsiaTheme="majorEastAsia"/>
-          <w:b/>
-          <w:sz w:val="22"/>
-          <w:szCs w:val="24"/>
-        </w:rPr>
-        <w:t>Sr. Software Engineer</w:t>
-      </w:r>
-    </w:p>
-    <w:p>
-      <w:pPr>
-        <w:pStyle w:val="9"/>
-        <w:numPr>
-          <w:ilvl w:val="0"/>
-          <w:numId w:val="8"/>
-        </w:numPr>
-        <w:jc w:val="left"/>
-        <w:rPr>
-          <w:rFonts w:eastAsiaTheme="majorEastAsia"/>
-          <w:sz w:val="22"/>
-          <w:szCs w:val="24"/>
-          <w:u w:val="single"/>
-        </w:rPr>
-      </w:pPr>
-      <w:r>
-        <w:rPr>
-          <w:rFonts w:hint="eastAsia" w:eastAsiaTheme="majorEastAsia"/>
-          <w:sz w:val="22"/>
-          <w:szCs w:val="24"/>
-          <w:u w:val="single"/>
-        </w:rPr>
-        <w:t>基于UWB室内实时定位和博世生产系统的软件产品研发及测试系统搭建(</w:t>
-      </w:r>
-      <w:r>
-        <w:rPr>
-          <w:rFonts w:eastAsiaTheme="majorEastAsia"/>
-          <w:sz w:val="22"/>
-          <w:szCs w:val="24"/>
-          <w:u w:val="single"/>
-        </w:rPr>
-        <w:t>.NET, Python)</w:t>
-      </w:r>
-    </w:p>
-    <w:p>
-      <w:pPr>
-        <w:pStyle w:val="9"/>
-        <w:jc w:val="left"/>
-        <w:rPr>
-          <w:rFonts w:eastAsiaTheme="majorEastAsia"/>
-          <w:sz w:val="22"/>
-          <w:szCs w:val="24"/>
-        </w:rPr>
-      </w:pPr>
-      <w:r>
-        <w:rPr>
-          <w:rFonts w:hint="eastAsia" w:eastAsiaTheme="majorEastAsia"/>
-          <w:sz w:val="22"/>
-          <w:szCs w:val="24"/>
-        </w:rPr>
-        <w:t>作为核心成员，负责实时定位算法大数据处理及建模工作，并结合到博世生产系统。</w:t>
-      </w:r>
-    </w:p>
-    <w:p>
-      <w:pPr>
-        <w:pStyle w:val="9"/>
-        <w:numPr>
-          <w:ilvl w:val="0"/>
-          <w:numId w:val="8"/>
-        </w:numPr>
-        <w:jc w:val="left"/>
-        <w:rPr>
-          <w:rFonts w:eastAsiaTheme="majorEastAsia"/>
-          <w:sz w:val="22"/>
-          <w:szCs w:val="24"/>
-          <w:u w:val="single"/>
-        </w:rPr>
-      </w:pPr>
-      <w:r>
-        <w:rPr>
-          <w:rFonts w:hint="eastAsia" w:eastAsiaTheme="majorEastAsia"/>
-          <w:sz w:val="22"/>
-          <w:szCs w:val="24"/>
-          <w:u w:val="single"/>
-        </w:rPr>
-        <w:t>中德政府合作项目：基于3D实时定位的物流优化和碰撞规避(</w:t>
-      </w:r>
-      <w:r>
-        <w:rPr>
-          <w:rFonts w:eastAsiaTheme="majorEastAsia"/>
-          <w:sz w:val="22"/>
-          <w:szCs w:val="24"/>
-          <w:u w:val="single"/>
-        </w:rPr>
-        <w:t>.NET</w:t>
-      </w:r>
-      <w:r>
-        <w:rPr>
-          <w:rFonts w:hint="eastAsia" w:eastAsiaTheme="majorEastAsia"/>
-          <w:sz w:val="22"/>
-          <w:szCs w:val="24"/>
-          <w:u w:val="single"/>
-        </w:rPr>
-        <w:t>,</w:t>
-      </w:r>
-      <w:r>
-        <w:rPr>
-          <w:rFonts w:eastAsiaTheme="majorEastAsia"/>
-          <w:sz w:val="22"/>
-          <w:szCs w:val="24"/>
-          <w:u w:val="single"/>
-        </w:rPr>
-        <w:t xml:space="preserve"> Eclipse Mita, C)</w:t>
-      </w:r>
-    </w:p>
-    <w:p>
-      <w:pPr>
-        <w:pStyle w:val="9"/>
-        <w:jc w:val="left"/>
-        <w:rPr>
-          <w:rFonts w:eastAsiaTheme="majorEastAsia"/>
-          <w:sz w:val="22"/>
-          <w:szCs w:val="24"/>
-        </w:rPr>
-      </w:pPr>
-      <w:r>
-        <w:rPr>
-          <w:rFonts w:hint="eastAsia" w:eastAsiaTheme="majorEastAsia"/>
-          <w:sz w:val="22"/>
-          <w:szCs w:val="24"/>
-        </w:rPr>
-        <w:t>核心开发人员,</w:t>
-      </w:r>
-      <w:r>
-        <w:rPr>
-          <w:rFonts w:eastAsiaTheme="majorEastAsia"/>
-          <w:sz w:val="22"/>
-          <w:szCs w:val="24"/>
-        </w:rPr>
-        <w:t xml:space="preserve"> </w:t>
-      </w:r>
-      <w:r>
-        <w:rPr>
-          <w:rFonts w:hint="eastAsia" w:eastAsiaTheme="majorEastAsia"/>
-          <w:sz w:val="22"/>
-          <w:szCs w:val="24"/>
-        </w:rPr>
-        <w:t>负责基于IoT套件的机器大数据实时状态采集的软件产品研发。</w:t>
-      </w:r>
-    </w:p>
-    <w:p>
-      <w:pPr>
-        <w:pStyle w:val="9"/>
-        <w:jc w:val="left"/>
-        <w:rPr>
-          <w:rFonts w:eastAsiaTheme="majorEastAsia"/>
-          <w:sz w:val="22"/>
-          <w:szCs w:val="24"/>
-        </w:rPr>
-      </w:pPr>
-    </w:p>
-    <w:p>
-      <w:pPr>
-        <w:pStyle w:val="9"/>
-        <w:numPr>
-          <w:ilvl w:val="0"/>
-          <w:numId w:val="3"/>
-        </w:numPr>
-        <w:jc w:val="left"/>
-        <w:rPr>
-          <w:rFonts w:eastAsiaTheme="majorEastAsia"/>
-          <w:b/>
-          <w:sz w:val="22"/>
-          <w:szCs w:val="24"/>
-        </w:rPr>
-      </w:pPr>
-      <w:r>
-        <w:rPr>
-          <w:rFonts w:eastAsia="黑体"/>
-          <w:b/>
-          <w:sz w:val="22"/>
-          <w:szCs w:val="24"/>
-        </w:rPr>
-        <w:t>2014.07 – 2018.04</w:t>
-      </w:r>
-      <w:r>
-        <w:rPr>
-          <w:rFonts w:eastAsia="黑体"/>
-          <w:b/>
-          <w:sz w:val="22"/>
-          <w:szCs w:val="24"/>
-        </w:rPr>
-        <w:tab/>
-      </w:r>
-      <w:r>
-        <w:rPr>
-          <w:rFonts w:eastAsia="黑体"/>
-          <w:b/>
-          <w:sz w:val="22"/>
-          <w:szCs w:val="24"/>
-        </w:rPr>
-        <w:tab/>
-      </w:r>
-      <w:r>
-        <w:rPr>
-          <w:rFonts w:eastAsiaTheme="majorEastAsia"/>
-          <w:b/>
-          <w:sz w:val="22"/>
-          <w:szCs w:val="24"/>
-        </w:rPr>
-        <w:t xml:space="preserve">菲尼萨(Finisar)光电通讯科技（无锡） </w:t>
-      </w:r>
-      <w:r>
-        <w:rPr>
-          <w:rFonts w:eastAsia="黑体"/>
-          <w:b/>
-          <w:sz w:val="22"/>
-          <w:szCs w:val="24"/>
-        </w:rPr>
-        <w:t>Sr. Engineer</w:t>
-      </w:r>
-    </w:p>
-    <w:p>
-      <w:pPr>
-        <w:pStyle w:val="9"/>
-        <w:numPr>
-          <w:ilvl w:val="0"/>
-          <w:numId w:val="9"/>
-        </w:numPr>
-        <w:rPr>
-          <w:sz w:val="22"/>
-          <w:szCs w:val="24"/>
-          <w:u w:val="single"/>
-        </w:rPr>
-      </w:pPr>
-      <w:bookmarkStart w:id="5" w:name="OLE_LINK1"/>
-      <w:r>
-        <w:rPr>
           <w:rFonts w:hint="eastAsia"/>
-          <w:sz w:val="22"/>
-          <w:szCs w:val="24"/>
-          <w:u w:val="single"/>
-        </w:rPr>
-        <w:t>基于生产大数据的质量监督系统开发 (.Net, R,</w:t>
-      </w:r>
-      <w:r>
-        <w:rPr>
-          <w:sz w:val="22"/>
-          <w:szCs w:val="24"/>
-          <w:u w:val="single"/>
-        </w:rPr>
-        <w:t xml:space="preserve"> FineUI, SQL</w:t>
-      </w:r>
-      <w:r>
-        <w:rPr>
-          <w:rFonts w:hint="eastAsia"/>
-          <w:sz w:val="22"/>
-          <w:szCs w:val="24"/>
-          <w:u w:val="single"/>
-        </w:rPr>
-        <w:t>)</w:t>
-      </w:r>
-    </w:p>
-    <w:p>
-      <w:pPr>
-        <w:pStyle w:val="9"/>
-        <w:rPr>
-          <w:sz w:val="22"/>
-          <w:szCs w:val="24"/>
-        </w:rPr>
-      </w:pPr>
-      <w:r>
-        <w:rPr>
-          <w:rFonts w:hint="eastAsia"/>
-          <w:sz w:val="22"/>
-          <w:szCs w:val="24"/>
-        </w:rPr>
-        <w:t>结合生产大数据和6Sigma理论，使用.</w:t>
-      </w:r>
-      <w:r>
-        <w:rPr>
-          <w:sz w:val="22"/>
-          <w:szCs w:val="24"/>
-        </w:rPr>
-        <w:t>NET</w:t>
-      </w:r>
-      <w:r>
-        <w:rPr>
-          <w:rFonts w:hint="eastAsia"/>
-          <w:sz w:val="22"/>
-          <w:szCs w:val="24"/>
-        </w:rPr>
-        <w:t>和R语言开发了诸如GRR,</w:t>
-      </w:r>
-      <w:r>
-        <w:rPr>
-          <w:sz w:val="22"/>
-          <w:szCs w:val="24"/>
-        </w:rPr>
-        <w:t xml:space="preserve"> SPC</w:t>
-      </w:r>
-      <w:r>
-        <w:rPr>
-          <w:rFonts w:hint="eastAsia"/>
-          <w:sz w:val="22"/>
-          <w:szCs w:val="24"/>
-        </w:rPr>
-        <w:t>和实时看板等质量监测工具与平台，实现了基于大数据的生产透明化。</w:t>
-      </w:r>
-    </w:p>
-    <w:p>
-      <w:pPr>
-        <w:pStyle w:val="9"/>
-        <w:numPr>
-          <w:ilvl w:val="0"/>
-          <w:numId w:val="9"/>
-        </w:numPr>
-        <w:rPr>
-          <w:sz w:val="22"/>
-          <w:szCs w:val="24"/>
-          <w:u w:val="single"/>
-        </w:rPr>
-      </w:pPr>
-      <w:r>
-        <w:rPr>
-          <w:sz w:val="22"/>
-          <w:szCs w:val="24"/>
-          <w:u w:val="single"/>
-        </w:rPr>
-        <w:t>光模块测试系统软件开发</w:t>
-      </w:r>
-      <w:r>
-        <w:rPr>
-          <w:rFonts w:hint="eastAsia"/>
-          <w:sz w:val="22"/>
-          <w:szCs w:val="24"/>
-          <w:u w:val="single"/>
-        </w:rPr>
-        <w:t>及软件测试平台本地化维护(</w:t>
-      </w:r>
-      <w:r>
-        <w:rPr>
-          <w:sz w:val="22"/>
-          <w:szCs w:val="24"/>
-          <w:u w:val="single"/>
-        </w:rPr>
-        <w:t>.NET, Labwindows CVI)</w:t>
-      </w:r>
-    </w:p>
-    <w:p>
-      <w:pPr>
-        <w:pStyle w:val="9"/>
-        <w:rPr>
-          <w:sz w:val="22"/>
-          <w:szCs w:val="24"/>
-        </w:rPr>
-      </w:pPr>
-      <w:r>
-        <w:rPr>
-          <w:rFonts w:hint="eastAsia"/>
-          <w:sz w:val="22"/>
-          <w:szCs w:val="24"/>
-        </w:rPr>
-        <w:t>定制化光模块测试工序软件开发</w:t>
-      </w:r>
-      <w:r>
-        <w:rPr>
-          <w:sz w:val="22"/>
-          <w:szCs w:val="24"/>
-        </w:rPr>
-        <w:t>，进行</w:t>
-      </w:r>
-      <w:r>
-        <w:rPr>
-          <w:rFonts w:hint="eastAsia"/>
-          <w:sz w:val="22"/>
-          <w:szCs w:val="24"/>
-        </w:rPr>
-        <w:t>测试大</w:t>
-      </w:r>
-      <w:r>
-        <w:rPr>
-          <w:sz w:val="22"/>
-          <w:szCs w:val="24"/>
-        </w:rPr>
-        <w:t>数据</w:t>
-      </w:r>
-      <w:r>
-        <w:rPr>
-          <w:rFonts w:hint="eastAsia"/>
-          <w:sz w:val="22"/>
-          <w:szCs w:val="24"/>
-        </w:rPr>
-        <w:t>采集、算法验证等</w:t>
-      </w:r>
-      <w:r>
-        <w:rPr>
-          <w:sz w:val="22"/>
-          <w:szCs w:val="24"/>
-        </w:rPr>
-        <w:t>。作为沟通窗口负责</w:t>
-      </w:r>
-      <w:r>
-        <w:rPr>
-          <w:rFonts w:hint="eastAsia"/>
-          <w:sz w:val="22"/>
-          <w:szCs w:val="24"/>
-        </w:rPr>
-        <w:t>与美国分公司进行生产大</w:t>
-      </w:r>
-      <w:r>
-        <w:rPr>
-          <w:sz w:val="22"/>
-          <w:szCs w:val="24"/>
-        </w:rPr>
-        <w:t>数据转移及测试维护等，</w:t>
-      </w:r>
-      <w:r>
-        <w:rPr>
-          <w:rFonts w:hint="eastAsia"/>
-          <w:sz w:val="22"/>
-          <w:szCs w:val="24"/>
-        </w:rPr>
-        <w:t>与马来西亚开发团队进行本地化维护与配置</w:t>
-      </w:r>
-      <w:r>
-        <w:rPr>
-          <w:sz w:val="22"/>
-          <w:szCs w:val="24"/>
-        </w:rPr>
-        <w:t>等。</w:t>
-      </w:r>
-    </w:p>
-    <w:bookmarkEnd w:id="5"/>
-    <w:p>
-      <w:pPr>
-        <w:pStyle w:val="9"/>
-        <w:rPr>
-          <w:sz w:val="22"/>
-          <w:szCs w:val="24"/>
-        </w:rPr>
-      </w:pPr>
-    </w:p>
-    <w:p>
-      <w:pPr>
-        <w:pStyle w:val="9"/>
-        <w:rPr>
-          <w:sz w:val="22"/>
-          <w:szCs w:val="24"/>
-        </w:rPr>
-      </w:pPr>
-    </w:p>
-    <w:p>
-      <w:pPr>
-        <w:pStyle w:val="9"/>
-        <w:rPr>
-          <w:sz w:val="22"/>
-          <w:szCs w:val="24"/>
-        </w:rPr>
-      </w:pPr>
-    </w:p>
-    <w:p>
-      <w:pPr>
-        <w:pStyle w:val="9"/>
-        <w:rPr>
-          <w:sz w:val="22"/>
-          <w:szCs w:val="24"/>
-        </w:rPr>
-      </w:pPr>
-    </w:p>
-    <w:p>
-      <w:pPr>
-        <w:pStyle w:val="9"/>
-        <w:rPr>
-          <w:sz w:val="22"/>
-          <w:szCs w:val="24"/>
-        </w:rPr>
-      </w:pPr>
-    </w:p>
-    <w:p>
-      <w:pPr>
-        <w:pStyle w:val="9"/>
-        <w:rPr>
-          <w:sz w:val="22"/>
-          <w:szCs w:val="24"/>
-        </w:rPr>
-      </w:pPr>
-    </w:p>
-    <w:p>
-      <w:pPr>
-        <w:pStyle w:val="9"/>
-        <w:rPr>
-          <w:sz w:val="22"/>
-          <w:szCs w:val="24"/>
-        </w:rPr>
-      </w:pPr>
-    </w:p>
-    <w:p>
-      <w:pPr>
-        <w:pStyle w:val="9"/>
-        <w:rPr>
-          <w:sz w:val="22"/>
-          <w:szCs w:val="24"/>
-        </w:rPr>
-      </w:pPr>
-    </w:p>
-    <w:p>
-      <w:pPr>
-        <w:pStyle w:val="9"/>
-        <w:rPr>
-          <w:sz w:val="22"/>
-          <w:szCs w:val="24"/>
-        </w:rPr>
-      </w:pPr>
-    </w:p>
-    <w:p>
-      <w:pPr>
-        <w:pStyle w:val="9"/>
-        <w:rPr>
-          <w:sz w:val="22"/>
-          <w:szCs w:val="24"/>
-        </w:rPr>
-      </w:pPr>
-    </w:p>
-    <w:p>
-      <w:pPr>
-        <w:pStyle w:val="9"/>
-        <w:rPr>
-          <w:sz w:val="22"/>
-          <w:szCs w:val="24"/>
-        </w:rPr>
-      </w:pPr>
-    </w:p>
-    <w:p>
-      <w:pPr>
-        <w:pStyle w:val="9"/>
-        <w:rPr>
-          <w:sz w:val="22"/>
-          <w:szCs w:val="24"/>
-        </w:rPr>
-      </w:pPr>
-    </w:p>
-    <w:p>
-      <w:pPr>
-        <w:pStyle w:val="9"/>
-        <w:rPr>
-          <w:sz w:val="22"/>
-          <w:szCs w:val="24"/>
-        </w:rPr>
-      </w:pPr>
-    </w:p>
-    <w:p>
-      <w:pPr>
-        <w:pStyle w:val="9"/>
-        <w:rPr>
-          <w:sz w:val="22"/>
-          <w:szCs w:val="24"/>
-        </w:rPr>
-      </w:pPr>
-    </w:p>
-    <w:p>
-      <w:pPr>
-        <w:pStyle w:val="9"/>
-        <w:jc w:val="center"/>
-        <w:rPr>
-          <w:sz w:val="22"/>
-          <w:szCs w:val="24"/>
-        </w:rPr>
-      </w:pPr>
-      <w:r>
-        <w:rPr>
-          <w:sz w:val="22"/>
-          <w:szCs w:val="24"/>
-        </w:rPr>
-        <w:t>Yang Shaopeng</w:t>
-      </w:r>
-    </w:p>
-    <w:p>
-      <w:pPr>
-        <w:pStyle w:val="9"/>
-        <w:rPr>
-          <w:sz w:val="22"/>
-          <w:szCs w:val="24"/>
-        </w:rPr>
-      </w:pPr>
-    </w:p>
-    <w:p>
-      <w:pPr>
-        <w:pStyle w:val="9"/>
-        <w:rPr>
-          <w:b/>
-          <w:bCs/>
-          <w:sz w:val="22"/>
-          <w:szCs w:val="24"/>
-        </w:rPr>
-      </w:pPr>
-      <w:r>
-        <w:rPr>
-          <w:b/>
-          <w:bCs/>
-          <w:sz w:val="22"/>
-          <w:szCs w:val="24"/>
-        </w:rPr>
-        <w:t>Personal Information:</w:t>
-      </w:r>
-    </w:p>
-    <w:p>
-      <w:pPr>
-        <w:pStyle w:val="9"/>
-        <w:numPr>
-          <w:ilvl w:val="0"/>
-          <w:numId w:val="10"/>
-        </w:numPr>
-        <w:rPr>
-          <w:sz w:val="22"/>
-          <w:szCs w:val="24"/>
-        </w:rPr>
-      </w:pPr>
-      <w:r>
-        <w:rPr>
-          <w:sz w:val="22"/>
-          <w:szCs w:val="24"/>
-        </w:rPr>
-        <w:t>Basic Info: Male | Date of Birth: Mar 1989 | Registered Residence: Wuxi, Jiangsu</w:t>
-      </w:r>
-    </w:p>
-    <w:p>
-      <w:pPr>
-        <w:pStyle w:val="9"/>
-        <w:numPr>
-          <w:ilvl w:val="0"/>
-          <w:numId w:val="10"/>
-        </w:numPr>
-        <w:rPr>
-          <w:sz w:val="22"/>
-          <w:szCs w:val="24"/>
-          <w:lang w:val="fr-FR"/>
-        </w:rPr>
-      </w:pPr>
-      <w:r>
-        <w:rPr>
-          <w:sz w:val="22"/>
-          <w:szCs w:val="24"/>
-          <w:lang w:val="fr-FR"/>
-        </w:rPr>
-        <w:t>Contact: +86 18262273079 | Email: youngtopsky@163.com</w:t>
-      </w:r>
-    </w:p>
-    <w:p>
-      <w:pPr>
-        <w:pStyle w:val="9"/>
-        <w:numPr>
-          <w:ilvl w:val="0"/>
-          <w:numId w:val="10"/>
-        </w:numPr>
-        <w:rPr>
-          <w:sz w:val="22"/>
-          <w:szCs w:val="24"/>
-          <w:lang w:val="fr-FR"/>
-        </w:rPr>
-      </w:pPr>
-      <w:r>
-        <w:rPr>
-          <w:sz w:val="22"/>
-          <w:szCs w:val="24"/>
-          <w:lang w:val="fr-FR"/>
-        </w:rPr>
-        <w:t>Education:</w:t>
-      </w:r>
-    </w:p>
-    <w:p>
-      <w:pPr>
-        <w:pStyle w:val="9"/>
-        <w:numPr>
-          <w:ilvl w:val="1"/>
-          <w:numId w:val="10"/>
-        </w:numPr>
-        <w:rPr>
-          <w:sz w:val="22"/>
-          <w:szCs w:val="24"/>
-        </w:rPr>
-      </w:pPr>
-      <w:r>
-        <w:rPr>
-          <w:sz w:val="22"/>
-          <w:szCs w:val="24"/>
-        </w:rPr>
-        <w:t>Master's Degree (Electronic and Communication Engineering), Jiangnan University, 2014</w:t>
-      </w:r>
-    </w:p>
-    <w:p>
-      <w:pPr>
-        <w:pStyle w:val="9"/>
-        <w:numPr>
-          <w:ilvl w:val="1"/>
-          <w:numId w:val="10"/>
-        </w:numPr>
-        <w:rPr>
-          <w:sz w:val="22"/>
-          <w:szCs w:val="24"/>
-        </w:rPr>
-      </w:pPr>
-      <w:r>
-        <w:rPr>
-          <w:sz w:val="22"/>
-          <w:szCs w:val="24"/>
-        </w:rPr>
-        <w:t>Bachelor's Degree (Electronic Information Engineering), Jiangnan University, 2011</w:t>
-      </w:r>
-    </w:p>
-    <w:p>
-      <w:pPr>
-        <w:pStyle w:val="9"/>
-        <w:rPr>
-          <w:sz w:val="22"/>
-          <w:szCs w:val="24"/>
-        </w:rPr>
-      </w:pPr>
-    </w:p>
-    <w:p>
-      <w:pPr>
-        <w:pStyle w:val="9"/>
-        <w:rPr>
-          <w:b/>
-          <w:bCs/>
-          <w:sz w:val="22"/>
-          <w:szCs w:val="24"/>
-        </w:rPr>
-      </w:pPr>
-      <w:r>
-        <w:rPr>
-          <w:b/>
-          <w:bCs/>
-          <w:sz w:val="22"/>
-          <w:szCs w:val="24"/>
-        </w:rPr>
-        <w:t>Professional Summary:</w:t>
-      </w:r>
-    </w:p>
-    <w:p>
-      <w:pPr>
-        <w:pStyle w:val="9"/>
-        <w:numPr>
-          <w:ilvl w:val="0"/>
-          <w:numId w:val="11"/>
-        </w:numPr>
-        <w:rPr>
-          <w:sz w:val="22"/>
-          <w:szCs w:val="24"/>
-        </w:rPr>
-      </w:pPr>
-      <w:r>
-        <w:rPr>
-          <w:sz w:val="22"/>
-          <w:szCs w:val="24"/>
-        </w:rPr>
-        <w:t>10+ Years Cross-Domain Experience: Encompassing Industrial IoT (IIoT), Big Data, and Machine Learning/LLM applications, proficient in the full Cloud-Pipe-Device stack.</w:t>
-      </w:r>
-    </w:p>
-    <w:p>
-      <w:pPr>
-        <w:pStyle w:val="9"/>
-        <w:numPr>
-          <w:ilvl w:val="0"/>
-          <w:numId w:val="11"/>
-        </w:numPr>
-        <w:rPr>
-          <w:sz w:val="22"/>
-          <w:szCs w:val="24"/>
-        </w:rPr>
-      </w:pPr>
-      <w:r>
-        <w:rPr>
-          <w:sz w:val="22"/>
-          <w:szCs w:val="24"/>
-        </w:rPr>
-        <w:t>Technology Integration Skills: Combines software/hardware development (Python/Java/.NET, Edge Linux), data analysis (SQL/R), and project management (Siemens Certified Project Manager).</w:t>
-      </w:r>
-    </w:p>
-    <w:p>
-      <w:pPr>
-        <w:pStyle w:val="9"/>
-        <w:numPr>
-          <w:ilvl w:val="0"/>
-          <w:numId w:val="11"/>
-        </w:numPr>
-        <w:rPr>
-          <w:sz w:val="22"/>
-          <w:szCs w:val="24"/>
-        </w:rPr>
-      </w:pPr>
-      <w:r>
-        <w:rPr>
-          <w:sz w:val="22"/>
-          <w:szCs w:val="24"/>
-        </w:rPr>
-        <w:t>Industry Practice: Deeply involved in digital solutions for semiconductor &amp; optical communication manufacturing/test development, automotive manufacturing &amp; software (Telematics, Predictive Maintenance, Catena-X Data Space), healthcare, energy, etc. Holds multiple patents and has experience delivering multinational projects.</w:t>
-      </w:r>
-    </w:p>
-    <w:p>
-      <w:pPr>
-        <w:pStyle w:val="9"/>
-        <w:numPr>
-          <w:ilvl w:val="0"/>
-          <w:numId w:val="11"/>
-        </w:numPr>
-        <w:rPr>
-          <w:sz w:val="22"/>
-          <w:szCs w:val="24"/>
-        </w:rPr>
-      </w:pPr>
-      <w:r>
-        <w:rPr>
-          <w:sz w:val="22"/>
-          <w:szCs w:val="24"/>
-        </w:rPr>
-        <w:t>Language: Fluent in English (Cambridge BEC Higher, TOEIC 980), with experience in multinational collaboration and technical presentations.</w:t>
-      </w:r>
-    </w:p>
-    <w:p>
-      <w:pPr>
-        <w:pStyle w:val="9"/>
-        <w:rPr>
-          <w:sz w:val="22"/>
-          <w:szCs w:val="24"/>
-        </w:rPr>
-      </w:pPr>
-    </w:p>
-    <w:p>
-      <w:pPr>
-        <w:pStyle w:val="9"/>
-        <w:rPr>
-          <w:b/>
-          <w:bCs/>
-          <w:sz w:val="22"/>
-          <w:szCs w:val="24"/>
-        </w:rPr>
-      </w:pPr>
-      <w:r>
-        <w:rPr>
-          <w:b/>
-          <w:bCs/>
-          <w:sz w:val="22"/>
-          <w:szCs w:val="24"/>
-        </w:rPr>
-        <w:t>Work &amp; Project Experience:</w:t>
+          <w:b w:val="0"/>
+          <w:bCs w:val="0"/>
+          <w:sz w:val="22"/>
+          <w:szCs w:val="24"/>
+        </w:rPr>
+        <w:t xml:space="preserve"> closely with other Lilly manufacturing sites and cross-functional global teams to consolidate business requirements, conduct market research on available technical solutions, design feasible technical architectures and roadmaps, and oversee full-cycle solution delivery and implementation.</w:t>
       </w:r>
     </w:p>
     <w:p>
@@ -3816,7 +4091,27 @@
           <w:sz w:val="22"/>
           <w:szCs w:val="24"/>
         </w:rPr>
-        <w:t xml:space="preserve"> 2021.06 – Present | Siemens Ltd., China, Wuxi Innovation Center | Expert Engineer</w:t>
+        <w:t xml:space="preserve"> 2021.06 – </w:t>
+      </w:r>
+      <w:r>
+        <w:rPr>
+          <w:rFonts w:hint="eastAsia"/>
+          <w:b/>
+          <w:bCs/>
+          <w:sz w:val="22"/>
+          <w:szCs w:val="24"/>
+          <w:lang w:val="en-US" w:eastAsia="zh-CN"/>
+        </w:rPr>
+        <w:t>2025.11</w:t>
+      </w:r>
+      <w:r>
+        <w:rPr>
+          <w:b/>
+          <w:bCs/>
+          <w:sz w:val="22"/>
+          <w:szCs w:val="24"/>
+        </w:rPr>
+        <w:t>| Siemens Ltd., China, Wuxi Innovation Center | Expert Engineer</w:t>
       </w:r>
     </w:p>
     <w:p>
@@ -6548,7 +6843,7 @@
   <w:docDefaults>
     <w:rPrDefault>
       <w:rPr>
-        <w:rFonts w:asciiTheme="minorHAnsi" w:hAnsiTheme="minorHAnsi" w:eastAsiaTheme="minorEastAsia" w:cstheme="minorBidi"/>
+        <w:rFonts w:ascii="Times New Roman" w:hAnsi="Times New Roman" w:eastAsia="宋体" w:cs="Times New Roman"/>
       </w:rPr>
     </w:rPrDefault>
     <w:pPrDefault/>
@@ -6909,6 +7204,7 @@
     <w:name w:val="Footer Char"/>
     <w:basedOn w:val="5"/>
     <w:link w:val="2"/>
+    <w:qFormat/>
     <w:uiPriority w:val="99"/>
     <w:rPr>
       <w:sz w:val="18"/>

</xml_diff>